<commit_message>
modificacion de la evidencia del proyecto
</commit_message>
<xml_diff>
--- a/Fase 2/Evidencia proyecto/Documento 02- Product Backlog.docx
+++ b/Fase 2/Evidencia proyecto/Documento 02- Product Backlog.docx
@@ -3256,6 +3256,264 @@
         </w:p>
         <w:p>
           <w:pPr>
+            <w:pStyle w:val="TDC1"/>
+            <w:tabs>
+              <w:tab w:val="left" w:pos="440"/>
+              <w:tab w:val="right" w:leader="dot" w:pos="8828"/>
+            </w:tabs>
+            <w:rPr>
+              <w:rFonts w:eastAsiaTheme="minorEastAsia"/>
+              <w:b w:val="0"/>
+              <w:bCs w:val="0"/>
+              <w:caps w:val="0"/>
+              <w:noProof/>
+              <w:kern w:val="2"/>
+              <w:sz w:val="24"/>
+              <w:szCs w:val="24"/>
+              <w:lang w:val="es-CL" w:eastAsia="es-MX"/>
+              <w14:ligatures w14:val="standardContextual"/>
+            </w:rPr>
+          </w:pPr>
+          <w:r>
+            <w:rPr>
+              <w:rStyle w:val="Hipervnculo"/>
+              <w:rFonts w:eastAsia="Times New Roman" w:cstheme="minorHAnsi"/>
+              <w:noProof/>
+              <w:kern w:val="32"/>
+            </w:rPr>
+            <w:t xml:space="preserve">6</w:t>
+          </w:r>
+          <w:r>
+            <w:rPr>
+              <w:rStyle w:val="Hipervnculo"/>
+              <w:rFonts w:eastAsia="Times New Roman" w:cstheme="minorHAnsi"/>
+              <w:noProof/>
+              <w:kern w:val="32"/>
+            </w:rPr>
+            <w:tab/>
+          </w:r>
+          <w:r>
+            <w:rPr>
+              <w:rStyle w:val="Hipervnculo"/>
+              <w:rFonts w:eastAsia="Times New Roman" w:cstheme="minorHAnsi"/>
+              <w:noProof/>
+              <w:kern w:val="32"/>
+            </w:rPr>
+            <w:t xml:space="preserve">Requisitos</w:t>
+          </w:r>
+          <w:r>
+            <w:rPr>
+              <w:rStyle w:val="Hipervnculo"/>
+              <w:rFonts w:eastAsia="Times New Roman" w:cstheme="minorHAnsi"/>
+              <w:noProof/>
+              <w:kern w:val="32"/>
+            </w:rPr>
+            <w:tab/>
+          </w:r>
+          <w:r>
+            <w:rPr>
+              <w:rStyle w:val="Hipervnculo"/>
+              <w:rFonts w:eastAsia="Times New Roman" w:cstheme="minorHAnsi"/>
+              <w:noProof/>
+              <w:kern w:val="32"/>
+            </w:rPr>
+            <w:t xml:space="preserve">9</w:t>
+          </w:r>
+        </w:p>
+        <w:p>
+          <w:pPr>
+            <w:pStyle w:val="TDC2"/>
+            <w:tabs>
+              <w:tab w:val="left" w:pos="880"/>
+              <w:tab w:val="right" w:leader="dot" w:pos="8828"/>
+            </w:tabs>
+            <w:rPr>
+              <w:rFonts w:eastAsiaTheme="minorEastAsia"/>
+              <w:smallCaps w:val="0"/>
+              <w:noProof/>
+              <w:kern w:val="2"/>
+              <w:sz w:val="24"/>
+              <w:szCs w:val="24"/>
+              <w:lang w:val="es-CL" w:eastAsia="es-MX"/>
+              <w14:ligatures w14:val="standardContextual"/>
+            </w:rPr>
+          </w:pPr>
+          <w:r>
+            <w:rPr>
+              <w:rStyle w:val="Hipervnculo"/>
+              <w:rFonts w:eastAsia="Times New Roman" w:cstheme="minorHAnsi"/>
+              <w:noProof/>
+              <w:kern w:val="32"/>
+            </w:rPr>
+            <w:t xml:space="preserve">6.1</w:t>
+          </w:r>
+          <w:r>
+            <w:rPr>
+              <w:rStyle w:val="Hipervnculo"/>
+              <w:rFonts w:eastAsia="Times New Roman" w:cstheme="minorHAnsi"/>
+              <w:noProof/>
+              <w:kern w:val="32"/>
+            </w:rPr>
+            <w:tab/>
+          </w:r>
+          <w:r>
+            <w:rPr>
+              <w:rStyle w:val="Hipervnculo"/>
+              <w:rFonts w:eastAsia="Times New Roman" w:cstheme="minorHAnsi"/>
+              <w:noProof/>
+              <w:kern w:val="32"/>
+            </w:rPr>
+            <w:t xml:space="preserve">Requisitos funcionales</w:t>
+          </w:r>
+          <w:r>
+            <w:rPr>
+              <w:rStyle w:val="Hipervnculo"/>
+              <w:rFonts w:eastAsia="Times New Roman" w:cstheme="minorHAnsi"/>
+              <w:noProof/>
+              <w:kern w:val="32"/>
+            </w:rPr>
+            <w:tab/>
+          </w:r>
+          <w:r>
+            <w:rPr>
+              <w:rStyle w:val="Hipervnculo"/>
+              <w:rFonts w:eastAsia="Times New Roman" w:cstheme="minorHAnsi"/>
+              <w:noProof/>
+              <w:kern w:val="32"/>
+            </w:rPr>
+            <w:t xml:space="preserve">9</w:t>
+          </w:r>
+        </w:p>
+        <w:p>
+          <w:pPr>
+            <w:pStyle w:val="TDC2"/>
+            <w:tabs>
+              <w:tab w:val="left" w:pos="880"/>
+              <w:tab w:val="right" w:leader="dot" w:pos="8828"/>
+            </w:tabs>
+            <w:rPr>
+              <w:rFonts w:eastAsiaTheme="minorEastAsia"/>
+              <w:smallCaps w:val="0"/>
+              <w:noProof/>
+              <w:kern w:val="2"/>
+              <w:sz w:val="24"/>
+              <w:szCs w:val="24"/>
+              <w:lang w:val="es-CL" w:eastAsia="es-MX"/>
+              <w14:ligatures w14:val="standardContextual"/>
+            </w:rPr>
+          </w:pPr>
+          <w:r>
+            <w:rPr>
+              <w:rStyle w:val="Hipervnculo"/>
+              <w:rFonts w:eastAsia="Times New Roman" w:cstheme="minorHAnsi"/>
+              <w:noProof/>
+              <w:kern w:val="32"/>
+            </w:rPr>
+            <w:t xml:space="preserve">6.2</w:t>
+          </w:r>
+          <w:r>
+            <w:rPr>
+              <w:rStyle w:val="Hipervnculo"/>
+              <w:rFonts w:eastAsia="Times New Roman" w:cstheme="minorHAnsi"/>
+              <w:noProof/>
+              <w:kern w:val="32"/>
+            </w:rPr>
+            <w:tab/>
+          </w:r>
+          <w:r>
+            <w:rPr>
+              <w:rStyle w:val="Hipervnculo"/>
+              <w:rFonts w:eastAsia="Times New Roman" w:cstheme="minorHAnsi"/>
+              <w:noProof/>
+              <w:kern w:val="32"/>
+            </w:rPr>
+            <w:t xml:space="preserve">Requisitos no funcionales</w:t>
+          </w:r>
+          <w:r>
+            <w:rPr>
+              <w:rStyle w:val="Hipervnculo"/>
+              <w:rFonts w:eastAsia="Times New Roman" w:cstheme="minorHAnsi"/>
+              <w:noProof/>
+              <w:kern w:val="32"/>
+            </w:rPr>
+            <w:tab/>
+          </w:r>
+          <w:r>
+            <w:rPr>
+              <w:rStyle w:val="Hipervnculo"/>
+              <w:rFonts w:eastAsia="Times New Roman" w:cstheme="minorHAnsi"/>
+              <w:noProof/>
+              <w:kern w:val="32"/>
+            </w:rPr>
+            <w:t xml:space="preserve">10</w:t>
+          </w:r>
+        </w:p>
+        <w:p>
+          <w:pPr>
+            <w:pStyle w:val="TDC2"/>
+            <w:tabs>
+              <w:tab w:val="left" w:pos="880"/>
+              <w:tab w:val="right" w:leader="dot" w:pos="8828"/>
+            </w:tabs>
+            <w:rPr>
+              <w:rFonts w:eastAsiaTheme="minorEastAsia"/>
+              <w:smallCaps w:val="0"/>
+              <w:noProof/>
+              <w:kern w:val="2"/>
+              <w:sz w:val="24"/>
+              <w:szCs w:val="24"/>
+              <w:lang w:val="es-CL" w:eastAsia="es-MX"/>
+              <w14:ligatures w14:val="standardContextual"/>
+            </w:rPr>
+          </w:pPr>
+          <w:r>
+            <w:rPr>
+              <w:rStyle w:val="Hipervnculo"/>
+              <w:rFonts w:eastAsia="Times New Roman" w:cstheme="minorHAnsi"/>
+              <w:noProof/>
+              <w:kern w:val="32"/>
+            </w:rPr>
+            <w:t xml:space="preserve">6.3</w:t>
+          </w:r>
+          <w:r>
+            <w:rPr>
+              <w:rStyle w:val="Hipervnculo"/>
+              <w:rFonts w:eastAsia="Times New Roman" w:cstheme="minorHAnsi"/>
+              <w:noProof/>
+              <w:kern w:val="32"/>
+            </w:rPr>
+            <w:tab/>
+          </w:r>
+          <w:r>
+            <w:rPr>
+              <w:rStyle w:val="Hipervnculo"/>
+              <w:rFonts w:eastAsia="Times New Roman" w:cstheme="minorHAnsi"/>
+              <w:noProof/>
+              <w:kern w:val="32"/>
+            </w:rPr>
+            <w:t xml:space="preserve">Referencias</w:t>
+          </w:r>
+          <w:r>
+            <w:rPr>
+              <w:rStyle w:val="Hipervnculo"/>
+              <w:rFonts w:eastAsia="Times New Roman" w:cstheme="minorHAnsi"/>
+              <w:noProof/>
+              <w:kern w:val="32"/>
+            </w:rPr>
+            <w:tab/>
+          </w:r>
+          <w:r>
+            <w:rPr>
+              <w:rStyle w:val="Hipervnculo"/>
+              <w:rFonts w:eastAsia="Times New Roman" w:cstheme="minorHAnsi"/>
+              <w:noProof/>
+              <w:kern w:val="32"/>
+            </w:rPr>
+            <w:t xml:space="preserve">11</w:t>
+          </w:r>
+        </w:p>
+        <w:p>
+          <w:pPr>
             <w:jc w:val="both"/>
             <w:rPr>
               <w:rFonts w:cstheme="minorHAnsi"/>
@@ -3551,7 +3809,7 @@
                 <w:color w:val="000000"/>
                 <w:sz w:val="18"/>
               </w:rPr>
-              <w:t>Versión inicial: 12 historias de usuario estimadas y priorizadas.</w:t>
+              <w:t>Versión inicial: 12 historias de usuario estimadas y priorizadas, con requisitos funcionales y no funcionales.</w:t>
             </w:r>
           </w:p>
         </w:tc>
@@ -3882,9 +4140,6 @@
     <w:p>
       <w:pPr/>
       <w:r>
-        <w:rPr>
-          <w:b w:val="0"/>
-        </w:rPr>
         <w:t>Como encargado de documentos quiero que el sistema detecte automáticamente las cotizaciones PDF que se suben a la carpeta de Google Drive para no tener que cargarlas a mano.</w:t>
       </w:r>
     </w:p>
@@ -3897,9 +4152,6 @@
         <w:t>Épica 001 · Ingesta y extracción automática.</w:t>
       </w:r>
       <w:r>
-        <w:rPr>
-          <w:b w:val="0"/>
-        </w:rPr>
         <w:t xml:space="preserve"> Peso: 5 puntos. Responsable: Ignacio Gonzalez.</w:t>
       </w:r>
     </w:p>
@@ -3921,9 +4173,6 @@
         <w:spacing w:after="40"/>
       </w:pPr>
       <w:r>
-        <w:rPr>
-          <w:b w:val="0"/>
-        </w:rPr>
         <w:t>Un PDF nuevo en la carpeta configurada se detecta en un máximo de 15 minutos.</w:t>
       </w:r>
     </w:p>
@@ -3937,9 +4186,6 @@
         <w:spacing w:after="40"/>
       </w:pPr>
       <w:r>
-        <w:rPr>
-          <w:b w:val="0"/>
-        </w:rPr>
         <w:t>El acceso a Drive usa una cuenta de servicio con permiso de solo lectura sobre esa carpeta.</w:t>
       </w:r>
     </w:p>
@@ -3953,9 +4199,6 @@
         <w:spacing w:after="40"/>
       </w:pPr>
       <w:r>
-        <w:rPr>
-          <w:b w:val="0"/>
-        </w:rPr>
         <w:t>Un archivo ya procesado no se vuelve a procesar: se identifica por su ID de Drive.</w:t>
       </w:r>
     </w:p>
@@ -3969,9 +4212,6 @@
         <w:spacing w:after="40"/>
       </w:pPr>
       <w:r>
-        <w:rPr>
-          <w:b w:val="0"/>
-        </w:rPr>
         <w:t>Los archivos que no son PDF se ignoran.</w:t>
       </w:r>
     </w:p>
@@ -3994,9 +4234,6 @@
     <w:p>
       <w:pPr/>
       <w:r>
-        <w:rPr>
-          <w:b w:val="0"/>
-        </w:rPr>
         <w:t>Como personal de administración quiero que el sistema extraiga el número, la fecha, el cliente, el RUT, los ítems y los montos de cada cotización para disponer de los datos sin transcribirlos.</w:t>
       </w:r>
     </w:p>
@@ -4009,9 +4246,6 @@
         <w:t>Épica 001 · Ingesta y extracción automática.</w:t>
       </w:r>
       <w:r>
-        <w:rPr>
-          <w:b w:val="0"/>
-        </w:rPr>
         <w:t xml:space="preserve"> Peso: 13 puntos. Responsable: Ignacio Gonzalez.</w:t>
       </w:r>
     </w:p>
@@ -4033,9 +4267,6 @@
         <w:spacing w:after="40"/>
       </w:pPr>
       <w:r>
-        <w:rPr>
-          <w:b w:val="0"/>
-        </w:rPr>
         <w:t>Extrae número, fecha de emisión, cliente, RUT (si existe), ítems (descripción, cantidad, unidad, precio unitario y subtotal), neto, IVA y total.</w:t>
       </w:r>
     </w:p>
@@ -4049,9 +4280,6 @@
         <w:spacing w:after="40"/>
       </w:pPr>
       <w:r>
-        <w:rPr>
-          <w:b w:val="0"/>
-        </w:rPr>
         <w:t>Con el set de PDFs de prueba de formato estándar, al menos el 95 % de las cotizaciones queda con todos sus campos correctos.</w:t>
       </w:r>
     </w:p>
@@ -4065,9 +4293,6 @@
         <w:spacing w:after="40"/>
       </w:pPr>
       <w:r>
-        <w:rPr>
-          <w:b w:val="0"/>
-        </w:rPr>
         <w:t>Un PDF sin número de cotización o sin capa de texto no se registra como cotización y queda registrado como error con su motivo.</w:t>
       </w:r>
     </w:p>
@@ -4081,9 +4306,6 @@
         <w:spacing w:after="40"/>
       </w:pPr>
       <w:r>
-        <w:rPr>
-          <w:b w:val="0"/>
-        </w:rPr>
         <w:t>Un campo que no está en el documento queda vacío; el sistema no inventa datos.</w:t>
       </w:r>
     </w:p>
@@ -4106,9 +4328,6 @@
     <w:p>
       <w:pPr/>
       <w:r>
-        <w:rPr>
-          <w:b w:val="0"/>
-        </w:rPr>
         <w:t>Como Product Owner quiero que se use inteligencia artificial solo cuando las reglas no logren extraer los campos obligatorios para mantener el control de los datos y un costo bajo.</w:t>
       </w:r>
     </w:p>
@@ -4121,9 +4340,6 @@
         <w:t>Épica 001 · Ingesta y extracción automática.</w:t>
       </w:r>
       <w:r>
-        <w:rPr>
-          <w:b w:val="0"/>
-        </w:rPr>
         <w:t xml:space="preserve"> Peso: 8 puntos. Responsable: Ignacio Gonzalez.</w:t>
       </w:r>
     </w:p>
@@ -4145,9 +4361,6 @@
         <w:spacing w:after="40"/>
       </w:pPr>
       <w:r>
-        <w:rPr>
-          <w:b w:val="0"/>
-        </w:rPr>
         <w:t>La IA se invoca únicamente si faltan campos obligatorios después de aplicar las reglas.</w:t>
       </w:r>
     </w:p>
@@ -4161,9 +4374,6 @@
         <w:spacing w:after="40"/>
       </w:pPr>
       <w:r>
-        <w:rPr>
-          <w:b w:val="0"/>
-        </w:rPr>
         <w:t>El resultado de la IA pasa por las mismas validaciones que el de las reglas.</w:t>
       </w:r>
     </w:p>
@@ -4177,9 +4387,6 @@
         <w:spacing w:after="40"/>
       </w:pPr>
       <w:r>
-        <w:rPr>
-          <w:b w:val="0"/>
-        </w:rPr>
         <w:t>Cada documento registra si se extrajo con reglas o con IA.</w:t>
       </w:r>
     </w:p>
@@ -4193,9 +4400,6 @@
         <w:spacing w:after="40"/>
       </w:pPr>
       <w:r>
-        <w:rPr>
-          <w:b w:val="0"/>
-        </w:rPr>
         <w:t>Si la IA falla o no responde, el documento queda como error y no se guardan datos parciales.</w:t>
       </w:r>
     </w:p>
@@ -4218,9 +4422,6 @@
     <w:p>
       <w:pPr/>
       <w:r>
-        <w:rPr>
-          <w:b w:val="0"/>
-        </w:rPr>
         <w:t>Como usuario quiero que cada cotización se guarde una sola vez y con datos normalizados para que las búsquedas y las métricas sean confiables.</w:t>
       </w:r>
     </w:p>
@@ -4233,9 +4434,6 @@
         <w:t>Épica 001 · Ingesta y extracción automática.</w:t>
       </w:r>
       <w:r>
-        <w:rPr>
-          <w:b w:val="0"/>
-        </w:rPr>
         <w:t xml:space="preserve"> Peso: 8 puntos. Responsable: Ignacio Gonzalez.</w:t>
       </w:r>
     </w:p>
@@ -4257,9 +4455,6 @@
         <w:spacing w:after="40"/>
       </w:pPr>
       <w:r>
-        <w:rPr>
-          <w:b w:val="0"/>
-        </w:rPr>
         <w:t>Las fechas se guardan como fecha, los montos como enteros en pesos y el RUT con un formato uniforme.</w:t>
       </w:r>
     </w:p>
@@ -4273,9 +4468,6 @@
         <w:spacing w:after="40"/>
       </w:pPr>
       <w:r>
-        <w:rPr>
-          <w:b w:val="0"/>
-        </w:rPr>
         <w:t>Un número de cotización no se registra dos veces, aunque el PDF se suba de nuevo con otro nombre.</w:t>
       </w:r>
     </w:p>
@@ -4289,9 +4481,6 @@
         <w:spacing w:after="40"/>
       </w:pPr>
       <w:r>
-        <w:rPr>
-          <w:b w:val="0"/>
-        </w:rPr>
         <w:t>Un mismo RUT corresponde a un solo cliente.</w:t>
       </w:r>
     </w:p>
@@ -4305,9 +4494,6 @@
         <w:spacing w:after="40"/>
       </w:pPr>
       <w:r>
-        <w:rPr>
-          <w:b w:val="0"/>
-        </w:rPr>
         <w:t>Si el total no es igual a neto + IVA, se registra una advertencia.</w:t>
       </w:r>
     </w:p>
@@ -4330,9 +4516,6 @@
     <w:p>
       <w:pPr/>
       <w:r>
-        <w:rPr>
-          <w:b w:val="0"/>
-        </w:rPr>
         <w:t>Como usuario quiero iniciar sesión con mi correo y contraseña para acceder a la información comercial de forma segura.</w:t>
       </w:r>
     </w:p>
@@ -4345,9 +4528,6 @@
         <w:t>Épica 002 · Consulta y visualización segura.</w:t>
       </w:r>
       <w:r>
-        <w:rPr>
-          <w:b w:val="0"/>
-        </w:rPr>
         <w:t xml:space="preserve"> Peso: 5 puntos. Responsable: Ignacio Gonzalez (API) y Claudio Cornejo (interfaz).</w:t>
       </w:r>
     </w:p>
@@ -4369,9 +4549,6 @@
         <w:spacing w:after="40"/>
       </w:pPr>
       <w:r>
-        <w:rPr>
-          <w:b w:val="0"/>
-        </w:rPr>
         <w:t>Sin sesión, cualquier pantalla redirige al inicio de sesión y, al entrar, vuelve a la pantalla pedida.</w:t>
       </w:r>
     </w:p>
@@ -4385,9 +4562,6 @@
         <w:spacing w:after="40"/>
       </w:pPr>
       <w:r>
-        <w:rPr>
-          <w:b w:val="0"/>
-        </w:rPr>
         <w:t>Con credenciales incorrectas se muestra un mensaje que no revela si falló el correo o la contraseña.</w:t>
       </w:r>
     </w:p>
@@ -4401,9 +4575,6 @@
         <w:spacing w:after="40"/>
       </w:pPr>
       <w:r>
-        <w:rPr>
-          <w:b w:val="0"/>
-        </w:rPr>
         <w:t>Las contraseñas se guardan con hash y el token (JWT) tiene fecha de expiración.</w:t>
       </w:r>
     </w:p>
@@ -4417,9 +4588,6 @@
         <w:spacing w:after="40"/>
       </w:pPr>
       <w:r>
-        <w:rPr>
-          <w:b w:val="0"/>
-        </w:rPr>
         <w:t>Al cerrar sesión o al vencer el token se vuelve al inicio de sesión y no quedan datos visibles.</w:t>
       </w:r>
     </w:p>
@@ -4442,9 +4610,6 @@
     <w:p>
       <w:pPr/>
       <w:r>
-        <w:rPr>
-          <w:b w:val="0"/>
-        </w:rPr>
         <w:t>Como Product Owner quiero que la API rechace toda solicitud sin un token válido para que la información comercial no quede expuesta.</w:t>
       </w:r>
     </w:p>
@@ -4457,9 +4622,6 @@
         <w:t>Épica 002 · Consulta y visualización segura.</w:t>
       </w:r>
       <w:r>
-        <w:rPr>
-          <w:b w:val="0"/>
-        </w:rPr>
         <w:t xml:space="preserve"> Peso: 3 puntos. Responsable: Ignacio Gonzalez.</w:t>
       </w:r>
     </w:p>
@@ -4481,9 +4643,6 @@
         <w:spacing w:after="40"/>
       </w:pPr>
       <w:r>
-        <w:rPr>
-          <w:b w:val="0"/>
-        </w:rPr>
         <w:t>Todos los endpoints, salvo el inicio de sesión, responden 401 sin un token válido.</w:t>
       </w:r>
     </w:p>
@@ -4497,9 +4656,6 @@
         <w:spacing w:after="40"/>
       </w:pPr>
       <w:r>
-        <w:rPr>
-          <w:b w:val="0"/>
-        </w:rPr>
         <w:t>CORS permite solo el origen del frontend.</w:t>
       </w:r>
     </w:p>
@@ -4513,9 +4669,6 @@
         <w:spacing w:after="40"/>
       </w:pPr>
       <w:r>
-        <w:rPr>
-          <w:b w:val="0"/>
-        </w:rPr>
         <w:t>Los errores del servidor no muestran detalles internos.</w:t>
       </w:r>
     </w:p>
@@ -4529,9 +4682,6 @@
         <w:spacing w:after="40"/>
       </w:pPr>
       <w:r>
-        <w:rPr>
-          <w:b w:val="0"/>
-        </w:rPr>
         <w:t>Ninguna credencial (Drive, JWT, IA, base de datos) está en el repositorio.</w:t>
       </w:r>
     </w:p>
@@ -4554,9 +4704,6 @@
     <w:p>
       <w:pPr/>
       <w:r>
-        <w:rPr>
-          <w:b w:val="0"/>
-        </w:rPr>
         <w:t>Como personal comercial quiero buscar cotizaciones por número, nombre del cliente o RUT para encontrar rápido la que necesito.</w:t>
       </w:r>
     </w:p>
@@ -4569,9 +4716,6 @@
         <w:t>Épica 002 · Consulta y visualización segura.</w:t>
       </w:r>
       <w:r>
-        <w:rPr>
-          <w:b w:val="0"/>
-        </w:rPr>
         <w:t xml:space="preserve"> Peso: 5 puntos. Responsable: Ignacio Gonzalez (API) y Claudio Cornejo (interfaz).</w:t>
       </w:r>
     </w:p>
@@ -4593,9 +4737,6 @@
         <w:spacing w:after="40"/>
       </w:pPr>
       <w:r>
-        <w:rPr>
-          <w:b w:val="0"/>
-        </w:rPr>
         <w:t>La búsqueda no distingue mayúsculas ni tildes.</w:t>
       </w:r>
     </w:p>
@@ -4609,9 +4750,6 @@
         <w:spacing w:after="40"/>
       </w:pPr>
       <w:r>
-        <w:rPr>
-          <w:b w:val="0"/>
-        </w:rPr>
         <w:t>El listado se ordena por fecha de emisión, de la más reciente a la más antigua, y se pagina de a 20.</w:t>
       </w:r>
     </w:p>
@@ -4625,9 +4763,6 @@
         <w:spacing w:after="40"/>
       </w:pPr>
       <w:r>
-        <w:rPr>
-          <w:b w:val="0"/>
-        </w:rPr>
         <w:t>Si no hay resultados, se informa y se ofrece limpiar los filtros.</w:t>
       </w:r>
     </w:p>
@@ -4641,9 +4776,6 @@
         <w:spacing w:after="40"/>
       </w:pPr>
       <w:r>
-        <w:rPr>
-          <w:b w:val="0"/>
-        </w:rPr>
         <w:t>Con 1.000 cotizaciones, los resultados aparecen en menos de 2 segundos.</w:t>
       </w:r>
     </w:p>
@@ -4666,9 +4798,6 @@
     <w:p>
       <w:pPr/>
       <w:r>
-        <w:rPr>
-          <w:b w:val="0"/>
-        </w:rPr>
         <w:t>Como personal comercial quiero filtrar el listado por cliente y por año para revisar el historial de un cliente o de un período.</w:t>
       </w:r>
     </w:p>
@@ -4681,9 +4810,6 @@
         <w:t>Épica 002 · Consulta y visualización segura.</w:t>
       </w:r>
       <w:r>
-        <w:rPr>
-          <w:b w:val="0"/>
-        </w:rPr>
         <w:t xml:space="preserve"> Peso: 3 puntos. Responsable: Ignacio Gonzalez (API) y Claudio Cornejo (interfaz).</w:t>
       </w:r>
     </w:p>
@@ -4705,9 +4831,6 @@
         <w:spacing w:after="40"/>
       </w:pPr>
       <w:r>
-        <w:rPr>
-          <w:b w:val="0"/>
-        </w:rPr>
         <w:t>Los filtros se combinan entre sí y con la búsqueda.</w:t>
       </w:r>
     </w:p>
@@ -4721,9 +4844,6 @@
         <w:spacing w:after="40"/>
       </w:pPr>
       <w:r>
-        <w:rPr>
-          <w:b w:val="0"/>
-        </w:rPr>
         <w:t>Los filtros quedan en la dirección de la página: se pueden compartir y se mantienen al recargar.</w:t>
       </w:r>
     </w:p>
@@ -4737,9 +4857,6 @@
         <w:spacing w:after="40"/>
       </w:pPr>
       <w:r>
-        <w:rPr>
-          <w:b w:val="0"/>
-        </w:rPr>
         <w:t>Valores inválidos en la dirección se ignoran sin mostrar un error.</w:t>
       </w:r>
     </w:p>
@@ -4762,9 +4879,6 @@
     <w:p>
       <w:pPr/>
       <w:r>
-        <w:rPr>
-          <w:b w:val="0"/>
-        </w:rPr>
         <w:t>Como personal comercial quiero ver los ítems y montos de una cotización y abrir su PDF original para revisarla sin buscar el archivo en Drive.</w:t>
       </w:r>
     </w:p>
@@ -4777,9 +4891,6 @@
         <w:t>Épica 002 · Consulta y visualización segura.</w:t>
       </w:r>
       <w:r>
-        <w:rPr>
-          <w:b w:val="0"/>
-        </w:rPr>
         <w:t xml:space="preserve"> Peso: 3 puntos. Responsable: Ignacio Gonzalez (API) y Claudio Cornejo (interfaz).</w:t>
       </w:r>
     </w:p>
@@ -4801,9 +4912,6 @@
         <w:spacing w:after="40"/>
       </w:pPr>
       <w:r>
-        <w:rPr>
-          <w:b w:val="0"/>
-        </w:rPr>
         <w:t>Muestra cliente, RUT, fecha de emisión, ítems, neto, IVA y total.</w:t>
       </w:r>
     </w:p>
@@ -4817,9 +4925,6 @@
         <w:spacing w:after="40"/>
       </w:pPr>
       <w:r>
-        <w:rPr>
-          <w:b w:val="0"/>
-        </w:rPr>
         <w:t>Incluye un enlace que abre el PDF original en Google Drive.</w:t>
       </w:r>
     </w:p>
@@ -4833,9 +4938,6 @@
         <w:spacing w:after="40"/>
       </w:pPr>
       <w:r>
-        <w:rPr>
-          <w:b w:val="0"/>
-        </w:rPr>
         <w:t>Si la cotización no existe, se muestra un mensaje y un enlace para volver.</w:t>
       </w:r>
     </w:p>
@@ -4858,9 +4960,6 @@
     <w:p>
       <w:pPr/>
       <w:r>
-        <w:rPr>
-          <w:b w:val="0"/>
-        </w:rPr>
         <w:t>Como administración quiero ver el total de cotizaciones, los clientes únicos y los montos cotizados para conocer la actividad comercial sin revisar cada PDF.</w:t>
       </w:r>
     </w:p>
@@ -4873,9 +4972,6 @@
         <w:t>Épica 002 · Consulta y visualización segura.</w:t>
       </w:r>
       <w:r>
-        <w:rPr>
-          <w:b w:val="0"/>
-        </w:rPr>
         <w:t xml:space="preserve"> Peso: 5 puntos. Responsable: Ignacio Gonzalez (API) y Claudio Cornejo (interfaz).</w:t>
       </w:r>
     </w:p>
@@ -4897,9 +4993,6 @@
         <w:spacing w:after="40"/>
       </w:pPr>
       <w:r>
-        <w:rPr>
-          <w:b w:val="0"/>
-        </w:rPr>
         <w:t>Muestra la cantidad de cotizaciones, los clientes únicos, el monto cotizado neto y el monto promedio.</w:t>
       </w:r>
     </w:p>
@@ -4913,9 +5006,6 @@
         <w:spacing w:after="40"/>
       </w:pPr>
       <w:r>
-        <w:rPr>
-          <w:b w:val="0"/>
-        </w:rPr>
         <w:t>Se puede filtrar por año y por cliente.</w:t>
       </w:r>
     </w:p>
@@ -4929,9 +5019,6 @@
         <w:spacing w:after="40"/>
       </w:pPr>
       <w:r>
-        <w:rPr>
-          <w:b w:val="0"/>
-        </w:rPr>
         <w:t>Los valores coinciden exactamente con consultas directas a la base de datos.</w:t>
       </w:r>
     </w:p>
@@ -4945,9 +5032,6 @@
         <w:spacing w:after="40"/>
       </w:pPr>
       <w:r>
-        <w:rPr>
-          <w:b w:val="0"/>
-        </w:rPr>
         <w:t>Se indica que los montos son cotizados y sin IVA.</w:t>
       </w:r>
     </w:p>
@@ -4970,9 +5054,6 @@
     <w:p>
       <w:pPr/>
       <w:r>
-        <w:rPr>
-          <w:b w:val="0"/>
-        </w:rPr>
         <w:t>Como administración quiero ver el monto cotizado por mes o por año para comparar períodos.</w:t>
       </w:r>
     </w:p>
@@ -4985,9 +5066,6 @@
         <w:t>Épica 002 · Consulta y visualización segura.</w:t>
       </w:r>
       <w:r>
-        <w:rPr>
-          <w:b w:val="0"/>
-        </w:rPr>
         <w:t xml:space="preserve"> Peso: 3 puntos. Responsable: Ignacio Gonzalez (API) y Claudio Cornejo (interfaz).</w:t>
       </w:r>
     </w:p>
@@ -5009,9 +5087,6 @@
         <w:spacing w:after="40"/>
       </w:pPr>
       <w:r>
-        <w:rPr>
-          <w:b w:val="0"/>
-        </w:rPr>
         <w:t>Con un año elegido, muestra todos los meses (hasta el mes actual en el año en curso), incluidos los meses sin actividad.</w:t>
       </w:r>
     </w:p>
@@ -5025,9 +5100,6 @@
         <w:spacing w:after="40"/>
       </w:pPr>
       <w:r>
-        <w:rPr>
-          <w:b w:val="0"/>
-        </w:rPr>
         <w:t>Con todos los años, muestra un total por año.</w:t>
       </w:r>
     </w:p>
@@ -5041,9 +5113,6 @@
         <w:spacing w:after="40"/>
       </w:pPr>
       <w:r>
-        <w:rPr>
-          <w:b w:val="0"/>
-        </w:rPr>
         <w:t>La suma de los períodos es igual al monto cotizado del resumen.</w:t>
       </w:r>
     </w:p>
@@ -5066,9 +5135,6 @@
     <w:p>
       <w:pPr/>
       <w:r>
-        <w:rPr>
-          <w:b w:val="0"/>
-        </w:rPr>
         <w:t>Como usuario quiero acceder a Cotiza+ desde una dirección web para usarlo sin instalar nada.</w:t>
       </w:r>
     </w:p>
@@ -5081,9 +5147,6 @@
         <w:t>Épica 002 · Consulta y visualización segura.</w:t>
       </w:r>
       <w:r>
-        <w:rPr>
-          <w:b w:val="0"/>
-        </w:rPr>
         <w:t xml:space="preserve"> Peso: 5 puntos. Responsable: Ignacio Gonzalez (API y base de datos) y Claudio Cornejo (frontend).</w:t>
       </w:r>
     </w:p>
@@ -5105,9 +5168,6 @@
         <w:spacing w:after="40"/>
       </w:pPr>
       <w:r>
-        <w:rPr>
-          <w:b w:val="0"/>
-        </w:rPr>
         <w:t>Frontend y API están publicados con HTTPS.</w:t>
       </w:r>
     </w:p>
@@ -5121,9 +5181,6 @@
         <w:spacing w:after="40"/>
       </w:pPr>
       <w:r>
-        <w:rPr>
-          <w:b w:val="0"/>
-        </w:rPr>
         <w:t>El flujo completo funciona en el ambiente publicado: un PDF subido a Drive aparece en el listado y en las métricas.</w:t>
       </w:r>
     </w:p>
@@ -5137,9 +5194,6 @@
         <w:spacing w:after="40"/>
       </w:pPr>
       <w:r>
-        <w:rPr>
-          <w:b w:val="0"/>
-        </w:rPr>
         <w:t>La verificación del contrato aprueba contra la API publicada.</w:t>
       </w:r>
     </w:p>
@@ -5162,9 +5216,6 @@
     <w:p>
       <w:pPr/>
       <w:r>
-        <w:rPr>
-          <w:b w:val="0"/>
-        </w:rPr>
         <w:t>El peso se estima en puntos de historia con la escala de Fibonacci (1, 2, 3, 5, 8, 13), comparando cada historia con HU-08 como referencia de 3 puntos. El peso considera complejidad, incertidumbre y esfuerzo del trabajo de backend y frontend juntos.</w:t>
       </w:r>
     </w:p>
@@ -6784,9 +6835,6 @@
     <w:p>
       <w:pPr/>
       <w:r>
-        <w:rPr>
-          <w:b w:val="0"/>
-        </w:rPr>
         <w:t>Criterios de priorización:</w:t>
       </w:r>
     </w:p>
@@ -6806,9 +6854,6 @@
         <w:t>Primero el acceso seguro (HU-05 y HU-06):</w:t>
       </w:r>
       <w:r>
-        <w:rPr>
-          <w:b w:val="0"/>
-        </w:rPr>
         <w:t xml:space="preserve"> todas las demás historias de consulta dependen de que la API exija sesión.</w:t>
       </w:r>
     </w:p>
@@ -6828,9 +6873,6 @@
         <w:t>Luego la ingesta (HU-01, HU-02 y HU-04):</w:t>
       </w:r>
       <w:r>
-        <w:rPr>
-          <w:b w:val="0"/>
-        </w:rPr>
         <w:t xml:space="preserve"> es la ruta crítica del proyecto; sin datos extraídos no hay nada que consultar ni medir.</w:t>
       </w:r>
     </w:p>
@@ -6850,9 +6892,6 @@
         <w:t>Después la consulta y las métricas (HU-07 a HU-11):</w:t>
       </w:r>
       <w:r>
-        <w:rPr>
-          <w:b w:val="0"/>
-        </w:rPr>
         <w:t xml:space="preserve"> la interfaz ya está construida con datos simulados, por lo que el trabajo restante es la API y la integración.</w:t>
       </w:r>
     </w:p>
@@ -6872,19 +6911,2266 @@
         <w:t>Al final la IA de respaldo (HU-03) y el despliegue (HU-12):</w:t>
       </w:r>
       <w:r>
+        <w:t xml:space="preserve"> la IA solo actúa sobre los documentos que las reglas no resuelven, y el despliegue necesita el sistema completo.</w:t>
+      </w:r>
+    </w:p>
+    <w:p>
+      <w:pPr/>
+      <w:r>
+        <w:t>El backlog se revisa al cierre de cada sprint. Si un sprint no alcanza su meta, se repriorizan las historias pendientes antes de mover la fecha de integración.</w:t>
+      </w:r>
+    </w:p>
+    <w:p>
+      <w:pPr>
+        <w:pStyle w:val="Ttulo1"/>
+      </w:pPr>
+      <w:r>
+        <w:t>Requisitos</w:t>
+      </w:r>
+    </w:p>
+    <w:p>
+      <w:pPr/>
+      <w:r>
+        <w:t>Las historias de usuario describen el producto desde el punto de vista de quien lo usa. Para cumplir con la documentación mínima de la asignatura, esta sección las expresa también como requisitos funcionales y agrega los requisitos no funcionales: las condiciones de calidad que el producto debe cumplir en todas las historias.</w:t>
+      </w:r>
+    </w:p>
+    <w:p>
+      <w:pPr>
+        <w:pStyle w:val="Ttulo2"/>
+      </w:pPr>
+      <w:r>
+        <w:t>Requisitos funcionales</w:t>
+      </w:r>
+    </w:p>
+    <w:p>
+      <w:pPr/>
+      <w:r>
+        <w:t>Cada requisito funcional corresponde a una historia de usuario. Sus criterios de aceptación detallan cómo se verifica.</w:t>
+      </w:r>
+    </w:p>
+    <w:tbl>
+      <w:tblPr>
+        <w:tblStyle w:val="Tablaconcuadrcula1"/>
+        <w:tblW w:w="8787" w:type="dxa"/>
+        <w:jc w:val="center"/>
+        <w:tblLayout w:type="fixed"/>
+        <w:tblLook w:firstColumn="1" w:firstRow="1" w:lastColumn="0" w:lastRow="0" w:noHBand="0" w:noVBand="1" w:val="04A0"/>
+      </w:tblPr>
+      <w:tblGrid>
+        <w:gridCol w:w="907"/>
+        <w:gridCol w:w="5669"/>
+        <w:gridCol w:w="964"/>
+        <w:gridCol w:w="1247"/>
+      </w:tblGrid>
+      <w:tr>
+        <w:trPr>
+          <w:tblHeader w:val="true"/>
+        </w:trPr>
+        <w:tc>
+          <w:tcPr>
+            <w:tcW w:type="dxa" w:w="907"/>
+            <w:shd w:val="clear" w:color="auto" w:fill="D9E2F3"/>
+          </w:tcPr>
+          <w:p>
+            <w:r>
+              <w:rPr>
+                <w:rFonts w:asciiTheme="minorHAnsi" w:hAnsiTheme="minorHAnsi" w:cstheme="minorHAnsi"/>
+                <w:b/>
+                <w:color w:val="000000"/>
+                <w:sz w:val="18"/>
+              </w:rPr>
+              <w:t>ID</w:t>
+            </w:r>
+          </w:p>
+        </w:tc>
+        <w:tc>
+          <w:tcPr>
+            <w:tcW w:type="dxa" w:w="5669"/>
+            <w:shd w:val="clear" w:color="auto" w:fill="D9E2F3"/>
+          </w:tcPr>
+          <w:p>
+            <w:r>
+              <w:rPr>
+                <w:rFonts w:asciiTheme="minorHAnsi" w:hAnsiTheme="minorHAnsi" w:cstheme="minorHAnsi"/>
+                <w:b/>
+                <w:color w:val="000000"/>
+                <w:sz w:val="18"/>
+              </w:rPr>
+              <w:t>Requisito funcional</w:t>
+            </w:r>
+          </w:p>
+        </w:tc>
+        <w:tc>
+          <w:tcPr>
+            <w:tcW w:type="dxa" w:w="964"/>
+            <w:shd w:val="clear" w:color="auto" w:fill="D9E2F3"/>
+          </w:tcPr>
+          <w:p>
+            <w:r>
+              <w:rPr>
+                <w:rFonts w:asciiTheme="minorHAnsi" w:hAnsiTheme="minorHAnsi" w:cstheme="minorHAnsi"/>
+                <w:b/>
+                <w:color w:val="000000"/>
+                <w:sz w:val="18"/>
+              </w:rPr>
+              <w:t>Historia</w:t>
+            </w:r>
+          </w:p>
+        </w:tc>
+        <w:tc>
+          <w:tcPr>
+            <w:tcW w:type="dxa" w:w="1247"/>
+            <w:shd w:val="clear" w:color="auto" w:fill="D9E2F3"/>
+          </w:tcPr>
+          <w:p>
+            <w:r>
+              <w:rPr>
+                <w:rFonts w:asciiTheme="minorHAnsi" w:hAnsiTheme="minorHAnsi" w:cstheme="minorHAnsi"/>
+                <w:b/>
+                <w:color w:val="000000"/>
+                <w:sz w:val="18"/>
+              </w:rPr>
+              <w:t>Épica</w:t>
+            </w:r>
+          </w:p>
+        </w:tc>
+      </w:tr>
+      <w:tr>
+        <w:tc>
+          <w:tcPr>
+            <w:tcW w:type="dxa" w:w="907"/>
+          </w:tcPr>
+          <w:p>
+            <w:r>
+              <w:rPr>
+                <w:rFonts w:asciiTheme="minorHAnsi" w:hAnsiTheme="minorHAnsi" w:cstheme="minorHAnsi"/>
+                <w:b w:val="0"/>
+                <w:color w:val="000000"/>
+                <w:sz w:val="18"/>
+              </w:rPr>
+              <w:t>RF-01</w:t>
+            </w:r>
+          </w:p>
+        </w:tc>
+        <w:tc>
+          <w:tcPr>
+            <w:tcW w:type="dxa" w:w="5669"/>
+          </w:tcPr>
+          <w:p>
+            <w:r>
+              <w:rPr>
+                <w:rFonts w:asciiTheme="minorHAnsi" w:hAnsiTheme="minorHAnsi" w:cstheme="minorHAnsi"/>
+                <w:b w:val="0"/>
+                <w:color w:val="000000"/>
+                <w:sz w:val="18"/>
+              </w:rPr>
+              <w:t>El sistema debe detectar los PDF nuevos de la carpeta de Google Drive configurada y descargarlos para procesarlos.</w:t>
+            </w:r>
+          </w:p>
+        </w:tc>
+        <w:tc>
+          <w:tcPr>
+            <w:tcW w:type="dxa" w:w="964"/>
+          </w:tcPr>
+          <w:p>
+            <w:r>
+              <w:rPr>
+                <w:rFonts w:asciiTheme="minorHAnsi" w:hAnsiTheme="minorHAnsi" w:cstheme="minorHAnsi"/>
+                <w:b w:val="0"/>
+                <w:color w:val="000000"/>
+                <w:sz w:val="18"/>
+              </w:rPr>
+              <w:t>HU-01</w:t>
+            </w:r>
+          </w:p>
+        </w:tc>
+        <w:tc>
+          <w:tcPr>
+            <w:tcW w:type="dxa" w:w="1247"/>
+          </w:tcPr>
+          <w:p>
+            <w:r>
+              <w:rPr>
+                <w:rFonts w:asciiTheme="minorHAnsi" w:hAnsiTheme="minorHAnsi" w:cstheme="minorHAnsi"/>
+                <w:b w:val="0"/>
+                <w:color w:val="000000"/>
+                <w:sz w:val="18"/>
+              </w:rPr>
+              <w:t>Épica 001</w:t>
+            </w:r>
+          </w:p>
+        </w:tc>
+      </w:tr>
+      <w:tr>
+        <w:tc>
+          <w:tcPr>
+            <w:tcW w:type="dxa" w:w="907"/>
+          </w:tcPr>
+          <w:p>
+            <w:r>
+              <w:rPr>
+                <w:rFonts w:asciiTheme="minorHAnsi" w:hAnsiTheme="minorHAnsi" w:cstheme="minorHAnsi"/>
+                <w:b w:val="0"/>
+                <w:color w:val="000000"/>
+                <w:sz w:val="18"/>
+              </w:rPr>
+              <w:t>RF-02</w:t>
+            </w:r>
+          </w:p>
+        </w:tc>
+        <w:tc>
+          <w:tcPr>
+            <w:tcW w:type="dxa" w:w="5669"/>
+          </w:tcPr>
+          <w:p>
+            <w:r>
+              <w:rPr>
+                <w:rFonts w:asciiTheme="minorHAnsi" w:hAnsiTheme="minorHAnsi" w:cstheme="minorHAnsi"/>
+                <w:b w:val="0"/>
+                <w:color w:val="000000"/>
+                <w:sz w:val="18"/>
+              </w:rPr>
+              <w:t>El sistema debe extraer con reglas el número, la fecha, el cliente, el RUT, los ítems, el neto, el IVA y el total de cada cotización.</w:t>
+            </w:r>
+          </w:p>
+        </w:tc>
+        <w:tc>
+          <w:tcPr>
+            <w:tcW w:type="dxa" w:w="964"/>
+          </w:tcPr>
+          <w:p>
+            <w:r>
+              <w:rPr>
+                <w:rFonts w:asciiTheme="minorHAnsi" w:hAnsiTheme="minorHAnsi" w:cstheme="minorHAnsi"/>
+                <w:b w:val="0"/>
+                <w:color w:val="000000"/>
+                <w:sz w:val="18"/>
+              </w:rPr>
+              <w:t>HU-02</w:t>
+            </w:r>
+          </w:p>
+        </w:tc>
+        <w:tc>
+          <w:tcPr>
+            <w:tcW w:type="dxa" w:w="1247"/>
+          </w:tcPr>
+          <w:p>
+            <w:r>
+              <w:rPr>
+                <w:rFonts w:asciiTheme="minorHAnsi" w:hAnsiTheme="minorHAnsi" w:cstheme="minorHAnsi"/>
+                <w:b w:val="0"/>
+                <w:color w:val="000000"/>
+                <w:sz w:val="18"/>
+              </w:rPr>
+              <w:t>Épica 001</w:t>
+            </w:r>
+          </w:p>
+        </w:tc>
+      </w:tr>
+      <w:tr>
+        <w:tc>
+          <w:tcPr>
+            <w:tcW w:type="dxa" w:w="907"/>
+          </w:tcPr>
+          <w:p>
+            <w:r>
+              <w:rPr>
+                <w:rFonts w:asciiTheme="minorHAnsi" w:hAnsiTheme="minorHAnsi" w:cstheme="minorHAnsi"/>
+                <w:b w:val="0"/>
+                <w:color w:val="000000"/>
+                <w:sz w:val="18"/>
+              </w:rPr>
+              <w:t>RF-03</w:t>
+            </w:r>
+          </w:p>
+        </w:tc>
+        <w:tc>
+          <w:tcPr>
+            <w:tcW w:type="dxa" w:w="5669"/>
+          </w:tcPr>
+          <w:p>
+            <w:r>
+              <w:rPr>
+                <w:rFonts w:asciiTheme="minorHAnsi" w:hAnsiTheme="minorHAnsi" w:cstheme="minorHAnsi"/>
+                <w:b w:val="0"/>
+                <w:color w:val="000000"/>
+                <w:sz w:val="18"/>
+              </w:rPr>
+              <w:t>El sistema debe usar un servicio de IA solo cuando las reglas no obtienen los campos obligatorios, y registrar qué método se usó.</w:t>
+            </w:r>
+          </w:p>
+        </w:tc>
+        <w:tc>
+          <w:tcPr>
+            <w:tcW w:type="dxa" w:w="964"/>
+          </w:tcPr>
+          <w:p>
+            <w:r>
+              <w:rPr>
+                <w:rFonts w:asciiTheme="minorHAnsi" w:hAnsiTheme="minorHAnsi" w:cstheme="minorHAnsi"/>
+                <w:b w:val="0"/>
+                <w:color w:val="000000"/>
+                <w:sz w:val="18"/>
+              </w:rPr>
+              <w:t>HU-03</w:t>
+            </w:r>
+          </w:p>
+        </w:tc>
+        <w:tc>
+          <w:tcPr>
+            <w:tcW w:type="dxa" w:w="1247"/>
+          </w:tcPr>
+          <w:p>
+            <w:r>
+              <w:rPr>
+                <w:rFonts w:asciiTheme="minorHAnsi" w:hAnsiTheme="minorHAnsi" w:cstheme="minorHAnsi"/>
+                <w:b w:val="0"/>
+                <w:color w:val="000000"/>
+                <w:sz w:val="18"/>
+              </w:rPr>
+              <w:t>Épica 001</w:t>
+            </w:r>
+          </w:p>
+        </w:tc>
+      </w:tr>
+      <w:tr>
+        <w:tc>
+          <w:tcPr>
+            <w:tcW w:type="dxa" w:w="907"/>
+          </w:tcPr>
+          <w:p>
+            <w:r>
+              <w:rPr>
+                <w:rFonts w:asciiTheme="minorHAnsi" w:hAnsiTheme="minorHAnsi" w:cstheme="minorHAnsi"/>
+                <w:b w:val="0"/>
+                <w:color w:val="000000"/>
+                <w:sz w:val="18"/>
+              </w:rPr>
+              <w:t>RF-04</w:t>
+            </w:r>
+          </w:p>
+        </w:tc>
+        <w:tc>
+          <w:tcPr>
+            <w:tcW w:type="dxa" w:w="5669"/>
+          </w:tcPr>
+          <w:p>
+            <w:r>
+              <w:rPr>
+                <w:rFonts w:asciiTheme="minorHAnsi" w:hAnsiTheme="minorHAnsi" w:cstheme="minorHAnsi"/>
+                <w:b w:val="0"/>
+                <w:color w:val="000000"/>
+                <w:sz w:val="18"/>
+              </w:rPr>
+              <w:t>El sistema debe normalizar los datos y almacenarlos en PostgreSQL sin duplicar cotizaciones ni clientes.</w:t>
+            </w:r>
+          </w:p>
+        </w:tc>
+        <w:tc>
+          <w:tcPr>
+            <w:tcW w:type="dxa" w:w="964"/>
+          </w:tcPr>
+          <w:p>
+            <w:r>
+              <w:rPr>
+                <w:rFonts w:asciiTheme="minorHAnsi" w:hAnsiTheme="minorHAnsi" w:cstheme="minorHAnsi"/>
+                <w:b w:val="0"/>
+                <w:color w:val="000000"/>
+                <w:sz w:val="18"/>
+              </w:rPr>
+              <w:t>HU-04</w:t>
+            </w:r>
+          </w:p>
+        </w:tc>
+        <w:tc>
+          <w:tcPr>
+            <w:tcW w:type="dxa" w:w="1247"/>
+          </w:tcPr>
+          <w:p>
+            <w:r>
+              <w:rPr>
+                <w:rFonts w:asciiTheme="minorHAnsi" w:hAnsiTheme="minorHAnsi" w:cstheme="minorHAnsi"/>
+                <w:b w:val="0"/>
+                <w:color w:val="000000"/>
+                <w:sz w:val="18"/>
+              </w:rPr>
+              <w:t>Épica 001</w:t>
+            </w:r>
+          </w:p>
+        </w:tc>
+      </w:tr>
+      <w:tr>
+        <w:tc>
+          <w:tcPr>
+            <w:tcW w:type="dxa" w:w="907"/>
+          </w:tcPr>
+          <w:p>
+            <w:r>
+              <w:rPr>
+                <w:rFonts w:asciiTheme="minorHAnsi" w:hAnsiTheme="minorHAnsi" w:cstheme="minorHAnsi"/>
+                <w:b w:val="0"/>
+                <w:color w:val="000000"/>
+                <w:sz w:val="18"/>
+              </w:rPr>
+              <w:t>RF-05</w:t>
+            </w:r>
+          </w:p>
+        </w:tc>
+        <w:tc>
+          <w:tcPr>
+            <w:tcW w:type="dxa" w:w="5669"/>
+          </w:tcPr>
+          <w:p>
+            <w:r>
+              <w:rPr>
+                <w:rFonts w:asciiTheme="minorHAnsi" w:hAnsiTheme="minorHAnsi" w:cstheme="minorHAnsi"/>
+                <w:b w:val="0"/>
+                <w:color w:val="000000"/>
+                <w:sz w:val="18"/>
+              </w:rPr>
+              <w:t>El sistema debe permitir iniciar y cerrar sesión con correo y contraseña.</w:t>
+            </w:r>
+          </w:p>
+        </w:tc>
+        <w:tc>
+          <w:tcPr>
+            <w:tcW w:type="dxa" w:w="964"/>
+          </w:tcPr>
+          <w:p>
+            <w:r>
+              <w:rPr>
+                <w:rFonts w:asciiTheme="minorHAnsi" w:hAnsiTheme="minorHAnsi" w:cstheme="minorHAnsi"/>
+                <w:b w:val="0"/>
+                <w:color w:val="000000"/>
+                <w:sz w:val="18"/>
+              </w:rPr>
+              <w:t>HU-05</w:t>
+            </w:r>
+          </w:p>
+        </w:tc>
+        <w:tc>
+          <w:tcPr>
+            <w:tcW w:type="dxa" w:w="1247"/>
+          </w:tcPr>
+          <w:p>
+            <w:r>
+              <w:rPr>
+                <w:rFonts w:asciiTheme="minorHAnsi" w:hAnsiTheme="minorHAnsi" w:cstheme="minorHAnsi"/>
+                <w:b w:val="0"/>
+                <w:color w:val="000000"/>
+                <w:sz w:val="18"/>
+              </w:rPr>
+              <w:t>Épica 002</w:t>
+            </w:r>
+          </w:p>
+        </w:tc>
+      </w:tr>
+      <w:tr>
+        <w:tc>
+          <w:tcPr>
+            <w:tcW w:type="dxa" w:w="907"/>
+          </w:tcPr>
+          <w:p>
+            <w:r>
+              <w:rPr>
+                <w:rFonts w:asciiTheme="minorHAnsi" w:hAnsiTheme="minorHAnsi" w:cstheme="minorHAnsi"/>
+                <w:b w:val="0"/>
+                <w:color w:val="000000"/>
+                <w:sz w:val="18"/>
+              </w:rPr>
+              <w:t>RF-06</w:t>
+            </w:r>
+          </w:p>
+        </w:tc>
+        <w:tc>
+          <w:tcPr>
+            <w:tcW w:type="dxa" w:w="5669"/>
+          </w:tcPr>
+          <w:p>
+            <w:r>
+              <w:rPr>
+                <w:rFonts w:asciiTheme="minorHAnsi" w:hAnsiTheme="minorHAnsi" w:cstheme="minorHAnsi"/>
+                <w:b w:val="0"/>
+                <w:color w:val="000000"/>
+                <w:sz w:val="18"/>
+              </w:rPr>
+              <w:t>La API debe rechazar toda solicitud sin un token válido, salvo el inicio de sesión.</w:t>
+            </w:r>
+          </w:p>
+        </w:tc>
+        <w:tc>
+          <w:tcPr>
+            <w:tcW w:type="dxa" w:w="964"/>
+          </w:tcPr>
+          <w:p>
+            <w:r>
+              <w:rPr>
+                <w:rFonts w:asciiTheme="minorHAnsi" w:hAnsiTheme="minorHAnsi" w:cstheme="minorHAnsi"/>
+                <w:b w:val="0"/>
+                <w:color w:val="000000"/>
+                <w:sz w:val="18"/>
+              </w:rPr>
+              <w:t>HU-06</w:t>
+            </w:r>
+          </w:p>
+        </w:tc>
+        <w:tc>
+          <w:tcPr>
+            <w:tcW w:type="dxa" w:w="1247"/>
+          </w:tcPr>
+          <w:p>
+            <w:r>
+              <w:rPr>
+                <w:rFonts w:asciiTheme="minorHAnsi" w:hAnsiTheme="minorHAnsi" w:cstheme="minorHAnsi"/>
+                <w:b w:val="0"/>
+                <w:color w:val="000000"/>
+                <w:sz w:val="18"/>
+              </w:rPr>
+              <w:t>Épica 002</w:t>
+            </w:r>
+          </w:p>
+        </w:tc>
+      </w:tr>
+      <w:tr>
+        <w:tc>
+          <w:tcPr>
+            <w:tcW w:type="dxa" w:w="907"/>
+          </w:tcPr>
+          <w:p>
+            <w:r>
+              <w:rPr>
+                <w:rFonts w:asciiTheme="minorHAnsi" w:hAnsiTheme="minorHAnsi" w:cstheme="minorHAnsi"/>
+                <w:b w:val="0"/>
+                <w:color w:val="000000"/>
+                <w:sz w:val="18"/>
+              </w:rPr>
+              <w:t>RF-07</w:t>
+            </w:r>
+          </w:p>
+        </w:tc>
+        <w:tc>
+          <w:tcPr>
+            <w:tcW w:type="dxa" w:w="5669"/>
+          </w:tcPr>
+          <w:p>
+            <w:r>
+              <w:rPr>
+                <w:rFonts w:asciiTheme="minorHAnsi" w:hAnsiTheme="minorHAnsi" w:cstheme="minorHAnsi"/>
+                <w:b w:val="0"/>
+                <w:color w:val="000000"/>
+                <w:sz w:val="18"/>
+              </w:rPr>
+              <w:t>El sistema debe permitir buscar cotizaciones por número, nombre del cliente o RUT.</w:t>
+            </w:r>
+          </w:p>
+        </w:tc>
+        <w:tc>
+          <w:tcPr>
+            <w:tcW w:type="dxa" w:w="964"/>
+          </w:tcPr>
+          <w:p>
+            <w:r>
+              <w:rPr>
+                <w:rFonts w:asciiTheme="minorHAnsi" w:hAnsiTheme="minorHAnsi" w:cstheme="minorHAnsi"/>
+                <w:b w:val="0"/>
+                <w:color w:val="000000"/>
+                <w:sz w:val="18"/>
+              </w:rPr>
+              <w:t>HU-07</w:t>
+            </w:r>
+          </w:p>
+        </w:tc>
+        <w:tc>
+          <w:tcPr>
+            <w:tcW w:type="dxa" w:w="1247"/>
+          </w:tcPr>
+          <w:p>
+            <w:r>
+              <w:rPr>
+                <w:rFonts w:asciiTheme="minorHAnsi" w:hAnsiTheme="minorHAnsi" w:cstheme="minorHAnsi"/>
+                <w:b w:val="0"/>
+                <w:color w:val="000000"/>
+                <w:sz w:val="18"/>
+              </w:rPr>
+              <w:t>Épica 002</w:t>
+            </w:r>
+          </w:p>
+        </w:tc>
+      </w:tr>
+      <w:tr>
+        <w:tc>
+          <w:tcPr>
+            <w:tcW w:type="dxa" w:w="907"/>
+          </w:tcPr>
+          <w:p>
+            <w:r>
+              <w:rPr>
+                <w:rFonts w:asciiTheme="minorHAnsi" w:hAnsiTheme="minorHAnsi" w:cstheme="minorHAnsi"/>
+                <w:b w:val="0"/>
+                <w:color w:val="000000"/>
+                <w:sz w:val="18"/>
+              </w:rPr>
+              <w:t>RF-08</w:t>
+            </w:r>
+          </w:p>
+        </w:tc>
+        <w:tc>
+          <w:tcPr>
+            <w:tcW w:type="dxa" w:w="5669"/>
+          </w:tcPr>
+          <w:p>
+            <w:r>
+              <w:rPr>
+                <w:rFonts w:asciiTheme="minorHAnsi" w:hAnsiTheme="minorHAnsi" w:cstheme="minorHAnsi"/>
+                <w:b w:val="0"/>
+                <w:color w:val="000000"/>
+                <w:sz w:val="18"/>
+              </w:rPr>
+              <w:t>El sistema debe permitir filtrar las cotizaciones por cliente y por año, combinando los filtros con la búsqueda.</w:t>
+            </w:r>
+          </w:p>
+        </w:tc>
+        <w:tc>
+          <w:tcPr>
+            <w:tcW w:type="dxa" w:w="964"/>
+          </w:tcPr>
+          <w:p>
+            <w:r>
+              <w:rPr>
+                <w:rFonts w:asciiTheme="minorHAnsi" w:hAnsiTheme="minorHAnsi" w:cstheme="minorHAnsi"/>
+                <w:b w:val="0"/>
+                <w:color w:val="000000"/>
+                <w:sz w:val="18"/>
+              </w:rPr>
+              <w:t>HU-08</w:t>
+            </w:r>
+          </w:p>
+        </w:tc>
+        <w:tc>
+          <w:tcPr>
+            <w:tcW w:type="dxa" w:w="1247"/>
+          </w:tcPr>
+          <w:p>
+            <w:r>
+              <w:rPr>
+                <w:rFonts w:asciiTheme="minorHAnsi" w:hAnsiTheme="minorHAnsi" w:cstheme="minorHAnsi"/>
+                <w:b w:val="0"/>
+                <w:color w:val="000000"/>
+                <w:sz w:val="18"/>
+              </w:rPr>
+              <w:t>Épica 002</w:t>
+            </w:r>
+          </w:p>
+        </w:tc>
+      </w:tr>
+      <w:tr>
+        <w:tc>
+          <w:tcPr>
+            <w:tcW w:type="dxa" w:w="907"/>
+          </w:tcPr>
+          <w:p>
+            <w:r>
+              <w:rPr>
+                <w:rFonts w:asciiTheme="minorHAnsi" w:hAnsiTheme="minorHAnsi" w:cstheme="minorHAnsi"/>
+                <w:b w:val="0"/>
+                <w:color w:val="000000"/>
+                <w:sz w:val="18"/>
+              </w:rPr>
+              <w:t>RF-09</w:t>
+            </w:r>
+          </w:p>
+        </w:tc>
+        <w:tc>
+          <w:tcPr>
+            <w:tcW w:type="dxa" w:w="5669"/>
+          </w:tcPr>
+          <w:p>
+            <w:r>
+              <w:rPr>
+                <w:rFonts w:asciiTheme="minorHAnsi" w:hAnsiTheme="minorHAnsi" w:cstheme="minorHAnsi"/>
+                <w:b w:val="0"/>
+                <w:color w:val="000000"/>
+                <w:sz w:val="18"/>
+              </w:rPr>
+              <w:t>El sistema debe mostrar el detalle de una cotización con sus ítems, montos y el enlace al PDF original.</w:t>
+            </w:r>
+          </w:p>
+        </w:tc>
+        <w:tc>
+          <w:tcPr>
+            <w:tcW w:type="dxa" w:w="964"/>
+          </w:tcPr>
+          <w:p>
+            <w:r>
+              <w:rPr>
+                <w:rFonts w:asciiTheme="minorHAnsi" w:hAnsiTheme="minorHAnsi" w:cstheme="minorHAnsi"/>
+                <w:b w:val="0"/>
+                <w:color w:val="000000"/>
+                <w:sz w:val="18"/>
+              </w:rPr>
+              <w:t>HU-09</w:t>
+            </w:r>
+          </w:p>
+        </w:tc>
+        <w:tc>
+          <w:tcPr>
+            <w:tcW w:type="dxa" w:w="1247"/>
+          </w:tcPr>
+          <w:p>
+            <w:r>
+              <w:rPr>
+                <w:rFonts w:asciiTheme="minorHAnsi" w:hAnsiTheme="minorHAnsi" w:cstheme="minorHAnsi"/>
+                <w:b w:val="0"/>
+                <w:color w:val="000000"/>
+                <w:sz w:val="18"/>
+              </w:rPr>
+              <w:t>Épica 002</w:t>
+            </w:r>
+          </w:p>
+        </w:tc>
+      </w:tr>
+      <w:tr>
+        <w:tc>
+          <w:tcPr>
+            <w:tcW w:type="dxa" w:w="907"/>
+          </w:tcPr>
+          <w:p>
+            <w:r>
+              <w:rPr>
+                <w:rFonts w:asciiTheme="minorHAnsi" w:hAnsiTheme="minorHAnsi" w:cstheme="minorHAnsi"/>
+                <w:b w:val="0"/>
+                <w:color w:val="000000"/>
+                <w:sz w:val="18"/>
+              </w:rPr>
+              <w:t>RF-10</w:t>
+            </w:r>
+          </w:p>
+        </w:tc>
+        <w:tc>
+          <w:tcPr>
+            <w:tcW w:type="dxa" w:w="5669"/>
+          </w:tcPr>
+          <w:p>
+            <w:r>
+              <w:rPr>
+                <w:rFonts w:asciiTheme="minorHAnsi" w:hAnsiTheme="minorHAnsi" w:cstheme="minorHAnsi"/>
+                <w:b w:val="0"/>
+                <w:color w:val="000000"/>
+                <w:sz w:val="18"/>
+              </w:rPr>
+              <w:t>El sistema debe mostrar la cantidad de cotizaciones, los clientes únicos, el monto cotizado neto y el monto promedio.</w:t>
+            </w:r>
+          </w:p>
+        </w:tc>
+        <w:tc>
+          <w:tcPr>
+            <w:tcW w:type="dxa" w:w="964"/>
+          </w:tcPr>
+          <w:p>
+            <w:r>
+              <w:rPr>
+                <w:rFonts w:asciiTheme="minorHAnsi" w:hAnsiTheme="minorHAnsi" w:cstheme="minorHAnsi"/>
+                <w:b w:val="0"/>
+                <w:color w:val="000000"/>
+                <w:sz w:val="18"/>
+              </w:rPr>
+              <w:t>HU-10</w:t>
+            </w:r>
+          </w:p>
+        </w:tc>
+        <w:tc>
+          <w:tcPr>
+            <w:tcW w:type="dxa" w:w="1247"/>
+          </w:tcPr>
+          <w:p>
+            <w:r>
+              <w:rPr>
+                <w:rFonts w:asciiTheme="minorHAnsi" w:hAnsiTheme="minorHAnsi" w:cstheme="minorHAnsi"/>
+                <w:b w:val="0"/>
+                <w:color w:val="000000"/>
+                <w:sz w:val="18"/>
+              </w:rPr>
+              <w:t>Épica 002</w:t>
+            </w:r>
+          </w:p>
+        </w:tc>
+      </w:tr>
+      <w:tr>
+        <w:tc>
+          <w:tcPr>
+            <w:tcW w:type="dxa" w:w="907"/>
+          </w:tcPr>
+          <w:p>
+            <w:r>
+              <w:rPr>
+                <w:rFonts w:asciiTheme="minorHAnsi" w:hAnsiTheme="minorHAnsi" w:cstheme="minorHAnsi"/>
+                <w:b w:val="0"/>
+                <w:color w:val="000000"/>
+                <w:sz w:val="18"/>
+              </w:rPr>
+              <w:t>RF-11</w:t>
+            </w:r>
+          </w:p>
+        </w:tc>
+        <w:tc>
+          <w:tcPr>
+            <w:tcW w:type="dxa" w:w="5669"/>
+          </w:tcPr>
+          <w:p>
+            <w:r>
+              <w:rPr>
+                <w:rFonts w:asciiTheme="minorHAnsi" w:hAnsiTheme="minorHAnsi" w:cstheme="minorHAnsi"/>
+                <w:b w:val="0"/>
+                <w:color w:val="000000"/>
+                <w:sz w:val="18"/>
+              </w:rPr>
+              <w:t>El sistema debe mostrar el monto cotizado por mes de un año o por año, incluidos los períodos sin actividad.</w:t>
+            </w:r>
+          </w:p>
+        </w:tc>
+        <w:tc>
+          <w:tcPr>
+            <w:tcW w:type="dxa" w:w="964"/>
+          </w:tcPr>
+          <w:p>
+            <w:r>
+              <w:rPr>
+                <w:rFonts w:asciiTheme="minorHAnsi" w:hAnsiTheme="minorHAnsi" w:cstheme="minorHAnsi"/>
+                <w:b w:val="0"/>
+                <w:color w:val="000000"/>
+                <w:sz w:val="18"/>
+              </w:rPr>
+              <w:t>HU-11</w:t>
+            </w:r>
+          </w:p>
+        </w:tc>
+        <w:tc>
+          <w:tcPr>
+            <w:tcW w:type="dxa" w:w="1247"/>
+          </w:tcPr>
+          <w:p>
+            <w:r>
+              <w:rPr>
+                <w:rFonts w:asciiTheme="minorHAnsi" w:hAnsiTheme="minorHAnsi" w:cstheme="minorHAnsi"/>
+                <w:b w:val="0"/>
+                <w:color w:val="000000"/>
+                <w:sz w:val="18"/>
+              </w:rPr>
+              <w:t>Épica 002</w:t>
+            </w:r>
+          </w:p>
+        </w:tc>
+      </w:tr>
+      <w:tr>
+        <w:tc>
+          <w:tcPr>
+            <w:tcW w:type="dxa" w:w="907"/>
+          </w:tcPr>
+          <w:p>
+            <w:r>
+              <w:rPr>
+                <w:rFonts w:asciiTheme="minorHAnsi" w:hAnsiTheme="minorHAnsi" w:cstheme="minorHAnsi"/>
+                <w:b w:val="0"/>
+                <w:color w:val="000000"/>
+                <w:sz w:val="18"/>
+              </w:rPr>
+              <w:t>RF-12</w:t>
+            </w:r>
+          </w:p>
+        </w:tc>
+        <w:tc>
+          <w:tcPr>
+            <w:tcW w:type="dxa" w:w="5669"/>
+          </w:tcPr>
+          <w:p>
+            <w:r>
+              <w:rPr>
+                <w:rFonts w:asciiTheme="minorHAnsi" w:hAnsiTheme="minorHAnsi" w:cstheme="minorHAnsi"/>
+                <w:b w:val="0"/>
+                <w:color w:val="000000"/>
+                <w:sz w:val="18"/>
+              </w:rPr>
+              <w:t>El sistema debe estar disponible desde internet para los usuarios autorizados.</w:t>
+            </w:r>
+          </w:p>
+        </w:tc>
+        <w:tc>
+          <w:tcPr>
+            <w:tcW w:type="dxa" w:w="964"/>
+          </w:tcPr>
+          <w:p>
+            <w:r>
+              <w:rPr>
+                <w:rFonts w:asciiTheme="minorHAnsi" w:hAnsiTheme="minorHAnsi" w:cstheme="minorHAnsi"/>
+                <w:b w:val="0"/>
+                <w:color w:val="000000"/>
+                <w:sz w:val="18"/>
+              </w:rPr>
+              <w:t>HU-12</w:t>
+            </w:r>
+          </w:p>
+        </w:tc>
+        <w:tc>
+          <w:tcPr>
+            <w:tcW w:type="dxa" w:w="1247"/>
+          </w:tcPr>
+          <w:p>
+            <w:r>
+              <w:rPr>
+                <w:rFonts w:asciiTheme="minorHAnsi" w:hAnsiTheme="minorHAnsi" w:cstheme="minorHAnsi"/>
+                <w:b w:val="0"/>
+                <w:color w:val="000000"/>
+                <w:sz w:val="18"/>
+              </w:rPr>
+              <w:t>Épica 002</w:t>
+            </w:r>
+          </w:p>
+        </w:tc>
+      </w:tr>
+    </w:tbl>
+    <w:p>
+      <w:pPr/>
+    </w:p>
+    <w:p>
+      <w:pPr>
+        <w:pStyle w:val="Ttulo2"/>
+      </w:pPr>
+      <w:r>
+        <w:t>Requisitos no funcionales</w:t>
+      </w:r>
+    </w:p>
+    <w:p>
+      <w:pPr/>
+      <w:r>
+        <w:t>Los requisitos no funcionales se clasifican según las características de calidad del producto de la norma ISO/IEC 25010 (2011). Cada uno tiene un criterio medible y una forma de verificarlo, que se incorpora al plan de pruebas del sprint en que se implementa la historia relacionada.</w:t>
+      </w:r>
+    </w:p>
+    <w:tbl>
+      <w:tblPr>
+        <w:tblStyle w:val="Tablaconcuadrcula1"/>
+        <w:tblW w:w="8788" w:type="dxa"/>
+        <w:jc w:val="center"/>
+        <w:tblLayout w:type="fixed"/>
+        <w:tblLook w:firstColumn="1" w:firstRow="1" w:lastColumn="0" w:lastRow="0" w:noHBand="0" w:noVBand="1" w:val="04A0"/>
+      </w:tblPr>
+      <w:tblGrid>
+        <w:gridCol w:w="907"/>
+        <w:gridCol w:w="1361"/>
+        <w:gridCol w:w="2778"/>
+        <w:gridCol w:w="2835"/>
+        <w:gridCol w:w="907"/>
+      </w:tblGrid>
+      <w:tr>
+        <w:trPr>
+          <w:tblHeader w:val="true"/>
+        </w:trPr>
+        <w:tc>
+          <w:tcPr>
+            <w:tcW w:type="dxa" w:w="907"/>
+            <w:shd w:val="clear" w:color="auto" w:fill="D9E2F3"/>
+          </w:tcPr>
+          <w:p>
+            <w:r>
+              <w:rPr>
+                <w:rFonts w:asciiTheme="minorHAnsi" w:hAnsiTheme="minorHAnsi" w:cstheme="minorHAnsi"/>
+                <w:b/>
+                <w:color w:val="000000"/>
+                <w:sz w:val="18"/>
+              </w:rPr>
+              <w:t>ID</w:t>
+            </w:r>
+          </w:p>
+        </w:tc>
+        <w:tc>
+          <w:tcPr>
+            <w:tcW w:type="dxa" w:w="1361"/>
+            <w:shd w:val="clear" w:color="auto" w:fill="D9E2F3"/>
+          </w:tcPr>
+          <w:p>
+            <w:r>
+              <w:rPr>
+                <w:rFonts w:asciiTheme="minorHAnsi" w:hAnsiTheme="minorHAnsi" w:cstheme="minorHAnsi"/>
+                <w:b/>
+                <w:color w:val="000000"/>
+                <w:sz w:val="18"/>
+              </w:rPr>
+              <w:t>Característica</w:t>
+            </w:r>
+          </w:p>
+        </w:tc>
+        <w:tc>
+          <w:tcPr>
+            <w:tcW w:type="dxa" w:w="2778"/>
+            <w:shd w:val="clear" w:color="auto" w:fill="D9E2F3"/>
+          </w:tcPr>
+          <w:p>
+            <w:r>
+              <w:rPr>
+                <w:rFonts w:asciiTheme="minorHAnsi" w:hAnsiTheme="minorHAnsi" w:cstheme="minorHAnsi"/>
+                <w:b/>
+                <w:color w:val="000000"/>
+                <w:sz w:val="18"/>
+              </w:rPr>
+              <w:t>Requisito</w:t>
+            </w:r>
+          </w:p>
+        </w:tc>
+        <w:tc>
+          <w:tcPr>
+            <w:tcW w:type="dxa" w:w="2835"/>
+            <w:shd w:val="clear" w:color="auto" w:fill="D9E2F3"/>
+          </w:tcPr>
+          <w:p>
+            <w:r>
+              <w:rPr>
+                <w:rFonts w:asciiTheme="minorHAnsi" w:hAnsiTheme="minorHAnsi" w:cstheme="minorHAnsi"/>
+                <w:b/>
+                <w:color w:val="000000"/>
+                <w:sz w:val="18"/>
+              </w:rPr>
+              <w:t>Verificación</w:t>
+            </w:r>
+          </w:p>
+        </w:tc>
+        <w:tc>
+          <w:tcPr>
+            <w:tcW w:type="dxa" w:w="907"/>
+            <w:shd w:val="clear" w:color="auto" w:fill="D9E2F3"/>
+          </w:tcPr>
+          <w:p>
+            <w:r>
+              <w:rPr>
+                <w:rFonts w:asciiTheme="minorHAnsi" w:hAnsiTheme="minorHAnsi" w:cstheme="minorHAnsi"/>
+                <w:b/>
+                <w:color w:val="000000"/>
+                <w:sz w:val="18"/>
+              </w:rPr>
+              <w:t>Historias</w:t>
+            </w:r>
+          </w:p>
+        </w:tc>
+      </w:tr>
+      <w:tr>
+        <w:tc>
+          <w:tcPr>
+            <w:tcW w:type="dxa" w:w="907"/>
+          </w:tcPr>
+          <w:p>
+            <w:r>
+              <w:rPr>
+                <w:rFonts w:asciiTheme="minorHAnsi" w:hAnsiTheme="minorHAnsi" w:cstheme="minorHAnsi"/>
+                <w:b w:val="0"/>
+                <w:color w:val="000000"/>
+                <w:sz w:val="18"/>
+              </w:rPr>
+              <w:t>RNF-01</w:t>
+            </w:r>
+          </w:p>
+        </w:tc>
+        <w:tc>
+          <w:tcPr>
+            <w:tcW w:type="dxa" w:w="1361"/>
+          </w:tcPr>
+          <w:p>
+            <w:r>
+              <w:rPr>
+                <w:rFonts w:asciiTheme="minorHAnsi" w:hAnsiTheme="minorHAnsi" w:cstheme="minorHAnsi"/>
+                <w:b w:val="0"/>
+                <w:color w:val="000000"/>
+                <w:sz w:val="18"/>
+              </w:rPr>
+              <w:t>Seguridad</w:t>
+            </w:r>
+          </w:p>
+        </w:tc>
+        <w:tc>
+          <w:tcPr>
+            <w:tcW w:type="dxa" w:w="2778"/>
+          </w:tcPr>
+          <w:p>
+            <w:r>
+              <w:rPr>
+                <w:rFonts w:asciiTheme="minorHAnsi" w:hAnsiTheme="minorHAnsi" w:cstheme="minorHAnsi"/>
+                <w:b w:val="0"/>
+                <w:color w:val="000000"/>
+                <w:sz w:val="18"/>
+              </w:rPr>
+              <w:t>El acceso exige sesión. Las contraseñas se guardan con un algoritmo de hash y el token JWT tiene fecha de expiración.</w:t>
+            </w:r>
+          </w:p>
+        </w:tc>
+        <w:tc>
+          <w:tcPr>
+            <w:tcW w:type="dxa" w:w="2835"/>
+          </w:tcPr>
+          <w:p>
+            <w:r>
+              <w:rPr>
+                <w:rFonts w:asciiTheme="minorHAnsi" w:hAnsiTheme="minorHAnsi" w:cstheme="minorHAnsi"/>
+                <w:b w:val="0"/>
+                <w:color w:val="000000"/>
+                <w:sz w:val="18"/>
+              </w:rPr>
+              <w:t>Prueba de integración: cada endpoint, salvo el inicio de sesión, responde 401 sin token o con un token vencido. Revisión de la tabla de usuarios: ninguna contraseña en texto plano.</w:t>
+            </w:r>
+          </w:p>
+        </w:tc>
+        <w:tc>
+          <w:tcPr>
+            <w:tcW w:type="dxa" w:w="907"/>
+          </w:tcPr>
+          <w:p>
+            <w:r>
+              <w:rPr>
+                <w:rFonts w:asciiTheme="minorHAnsi" w:hAnsiTheme="minorHAnsi" w:cstheme="minorHAnsi"/>
+                <w:b w:val="0"/>
+                <w:color w:val="000000"/>
+                <w:sz w:val="18"/>
+              </w:rPr>
+              <w:t>HU-05, HU-06</w:t>
+            </w:r>
+          </w:p>
+        </w:tc>
+      </w:tr>
+      <w:tr>
+        <w:tc>
+          <w:tcPr>
+            <w:tcW w:type="dxa" w:w="907"/>
+          </w:tcPr>
+          <w:p>
+            <w:r>
+              <w:rPr>
+                <w:rFonts w:asciiTheme="minorHAnsi" w:hAnsiTheme="minorHAnsi" w:cstheme="minorHAnsi"/>
+                <w:b w:val="0"/>
+                <w:color w:val="000000"/>
+                <w:sz w:val="18"/>
+              </w:rPr>
+              <w:t>RNF-02</w:t>
+            </w:r>
+          </w:p>
+        </w:tc>
+        <w:tc>
+          <w:tcPr>
+            <w:tcW w:type="dxa" w:w="1361"/>
+          </w:tcPr>
+          <w:p>
+            <w:r>
+              <w:rPr>
+                <w:rFonts w:asciiTheme="minorHAnsi" w:hAnsiTheme="minorHAnsi" w:cstheme="minorHAnsi"/>
+                <w:b w:val="0"/>
+                <w:color w:val="000000"/>
+                <w:sz w:val="18"/>
+              </w:rPr>
+              <w:t>Seguridad</w:t>
+            </w:r>
+          </w:p>
+        </w:tc>
+        <w:tc>
+          <w:tcPr>
+            <w:tcW w:type="dxa" w:w="2778"/>
+          </w:tcPr>
+          <w:p>
+            <w:r>
+              <w:rPr>
+                <w:rFonts w:asciiTheme="minorHAnsi" w:hAnsiTheme="minorHAnsi" w:cstheme="minorHAnsi"/>
+                <w:b w:val="0"/>
+                <w:color w:val="000000"/>
+                <w:sz w:val="18"/>
+              </w:rPr>
+              <w:t>Ninguna credencial (Google Drive, JWT, IA, base de datos) se guarda en el repositorio; se configuran con variables de entorno.</w:t>
+            </w:r>
+          </w:p>
+        </w:tc>
+        <w:tc>
+          <w:tcPr>
+            <w:tcW w:type="dxa" w:w="2835"/>
+          </w:tcPr>
+          <w:p>
+            <w:r>
+              <w:rPr>
+                <w:rFonts w:asciiTheme="minorHAnsi" w:hAnsiTheme="minorHAnsi" w:cstheme="minorHAnsi"/>
+                <w:b w:val="0"/>
+                <w:color w:val="000000"/>
+                <w:sz w:val="18"/>
+              </w:rPr>
+              <w:t>Revisión del repositorio y del historial de Git antes de cada entrega; el archivo .env está en .gitignore y solo se versiona un ejemplo sin valores.</w:t>
+            </w:r>
+          </w:p>
+        </w:tc>
+        <w:tc>
+          <w:tcPr>
+            <w:tcW w:type="dxa" w:w="907"/>
+          </w:tcPr>
+          <w:p>
+            <w:r>
+              <w:rPr>
+                <w:rFonts w:asciiTheme="minorHAnsi" w:hAnsiTheme="minorHAnsi" w:cstheme="minorHAnsi"/>
+                <w:b w:val="0"/>
+                <w:color w:val="000000"/>
+                <w:sz w:val="18"/>
+              </w:rPr>
+              <w:t>HU-06</w:t>
+            </w:r>
+          </w:p>
+        </w:tc>
+      </w:tr>
+      <w:tr>
+        <w:tc>
+          <w:tcPr>
+            <w:tcW w:type="dxa" w:w="907"/>
+          </w:tcPr>
+          <w:p>
+            <w:r>
+              <w:rPr>
+                <w:rFonts w:asciiTheme="minorHAnsi" w:hAnsiTheme="minorHAnsi" w:cstheme="minorHAnsi"/>
+                <w:b w:val="0"/>
+                <w:color w:val="000000"/>
+                <w:sz w:val="18"/>
+              </w:rPr>
+              <w:t>RNF-03</w:t>
+            </w:r>
+          </w:p>
+        </w:tc>
+        <w:tc>
+          <w:tcPr>
+            <w:tcW w:type="dxa" w:w="1361"/>
+          </w:tcPr>
+          <w:p>
+            <w:r>
+              <w:rPr>
+                <w:rFonts w:asciiTheme="minorHAnsi" w:hAnsiTheme="minorHAnsi" w:cstheme="minorHAnsi"/>
+                <w:b w:val="0"/>
+                <w:color w:val="000000"/>
+                <w:sz w:val="18"/>
+              </w:rPr>
+              <w:t>Seguridad</w:t>
+            </w:r>
+          </w:p>
+        </w:tc>
+        <w:tc>
+          <w:tcPr>
+            <w:tcW w:type="dxa" w:w="2778"/>
+          </w:tcPr>
+          <w:p>
+            <w:r>
+              <w:rPr>
+                <w:rFonts w:asciiTheme="minorHAnsi" w:hAnsiTheme="minorHAnsi" w:cstheme="minorHAnsi"/>
+                <w:b w:val="0"/>
+                <w:color w:val="000000"/>
+                <w:sz w:val="18"/>
+              </w:rPr>
+              <w:t>En el ambiente publicado la comunicación usa HTTPS, CORS acepta solo el origen del frontend y los errores no muestran detalles internos.</w:t>
+            </w:r>
+          </w:p>
+        </w:tc>
+        <w:tc>
+          <w:tcPr>
+            <w:tcW w:type="dxa" w:w="2835"/>
+          </w:tcPr>
+          <w:p>
+            <w:r>
+              <w:rPr>
+                <w:rFonts w:asciiTheme="minorHAnsi" w:hAnsiTheme="minorHAnsi" w:cstheme="minorHAnsi"/>
+                <w:b w:val="0"/>
+                <w:color w:val="000000"/>
+                <w:sz w:val="18"/>
+              </w:rPr>
+              <w:t>Prueba desde otro origen (rechazada), solicitud por HTTP (redirigida) y error forzado del servidor (mensaje genérico).</w:t>
+            </w:r>
+          </w:p>
+        </w:tc>
+        <w:tc>
+          <w:tcPr>
+            <w:tcW w:type="dxa" w:w="907"/>
+          </w:tcPr>
+          <w:p>
+            <w:r>
+              <w:rPr>
+                <w:rFonts w:asciiTheme="minorHAnsi" w:hAnsiTheme="minorHAnsi" w:cstheme="minorHAnsi"/>
+                <w:b w:val="0"/>
+                <w:color w:val="000000"/>
+                <w:sz w:val="18"/>
+              </w:rPr>
+              <w:t>HU-06, HU-12</w:t>
+            </w:r>
+          </w:p>
+        </w:tc>
+      </w:tr>
+      <w:tr>
+        <w:tc>
+          <w:tcPr>
+            <w:tcW w:type="dxa" w:w="907"/>
+          </w:tcPr>
+          <w:p>
+            <w:r>
+              <w:rPr>
+                <w:rFonts w:asciiTheme="minorHAnsi" w:hAnsiTheme="minorHAnsi" w:cstheme="minorHAnsi"/>
+                <w:b w:val="0"/>
+                <w:color w:val="000000"/>
+                <w:sz w:val="18"/>
+              </w:rPr>
+              <w:t>RNF-04</w:t>
+            </w:r>
+          </w:p>
+        </w:tc>
+        <w:tc>
+          <w:tcPr>
+            <w:tcW w:type="dxa" w:w="1361"/>
+          </w:tcPr>
+          <w:p>
+            <w:r>
+              <w:rPr>
+                <w:rFonts w:asciiTheme="minorHAnsi" w:hAnsiTheme="minorHAnsi" w:cstheme="minorHAnsi"/>
+                <w:b w:val="0"/>
+                <w:color w:val="000000"/>
+                <w:sz w:val="18"/>
+              </w:rPr>
+              <w:t>Seguridad</w:t>
+            </w:r>
+          </w:p>
+        </w:tc>
+        <w:tc>
+          <w:tcPr>
+            <w:tcW w:type="dxa" w:w="2778"/>
+          </w:tcPr>
+          <w:p>
+            <w:r>
+              <w:rPr>
+                <w:rFonts w:asciiTheme="minorHAnsi" w:hAnsiTheme="minorHAnsi" w:cstheme="minorHAnsi"/>
+                <w:b w:val="0"/>
+                <w:color w:val="000000"/>
+                <w:sz w:val="18"/>
+              </w:rPr>
+              <w:t>El acceso a Google Drive usa una cuenta de servicio con permiso de solo lectura sobre la carpeta de cotizaciones.</w:t>
+            </w:r>
+          </w:p>
+        </w:tc>
+        <w:tc>
+          <w:tcPr>
+            <w:tcW w:type="dxa" w:w="2835"/>
+          </w:tcPr>
+          <w:p>
+            <w:r>
+              <w:rPr>
+                <w:rFonts w:asciiTheme="minorHAnsi" w:hAnsiTheme="minorHAnsi" w:cstheme="minorHAnsi"/>
+                <w:b w:val="0"/>
+                <w:color w:val="000000"/>
+                <w:sz w:val="18"/>
+              </w:rPr>
+              <w:t>Revisión de los permisos de la cuenta de servicio en Google Cloud y prueba de escritura rechazada.</w:t>
+            </w:r>
+          </w:p>
+        </w:tc>
+        <w:tc>
+          <w:tcPr>
+            <w:tcW w:type="dxa" w:w="907"/>
+          </w:tcPr>
+          <w:p>
+            <w:r>
+              <w:rPr>
+                <w:rFonts w:asciiTheme="minorHAnsi" w:hAnsiTheme="minorHAnsi" w:cstheme="minorHAnsi"/>
+                <w:b w:val="0"/>
+                <w:color w:val="000000"/>
+                <w:sz w:val="18"/>
+              </w:rPr>
+              <w:t>HU-01</w:t>
+            </w:r>
+          </w:p>
+        </w:tc>
+      </w:tr>
+      <w:tr>
+        <w:tc>
+          <w:tcPr>
+            <w:tcW w:type="dxa" w:w="907"/>
+          </w:tcPr>
+          <w:p>
+            <w:r>
+              <w:rPr>
+                <w:rFonts w:asciiTheme="minorHAnsi" w:hAnsiTheme="minorHAnsi" w:cstheme="minorHAnsi"/>
+                <w:b w:val="0"/>
+                <w:color w:val="000000"/>
+                <w:sz w:val="18"/>
+              </w:rPr>
+              <w:t>RNF-05</w:t>
+            </w:r>
+          </w:p>
+        </w:tc>
+        <w:tc>
+          <w:tcPr>
+            <w:tcW w:type="dxa" w:w="1361"/>
+          </w:tcPr>
+          <w:p>
+            <w:r>
+              <w:rPr>
+                <w:rFonts w:asciiTheme="minorHAnsi" w:hAnsiTheme="minorHAnsi" w:cstheme="minorHAnsi"/>
+                <w:b w:val="0"/>
+                <w:color w:val="000000"/>
+                <w:sz w:val="18"/>
+              </w:rPr>
+              <w:t>Eficiencia de desempeño</w:t>
+            </w:r>
+          </w:p>
+        </w:tc>
+        <w:tc>
+          <w:tcPr>
+            <w:tcW w:type="dxa" w:w="2778"/>
+          </w:tcPr>
+          <w:p>
+            <w:r>
+              <w:rPr>
+                <w:rFonts w:asciiTheme="minorHAnsi" w:hAnsiTheme="minorHAnsi" w:cstheme="minorHAnsi"/>
+                <w:b w:val="0"/>
+                <w:color w:val="000000"/>
+                <w:sz w:val="18"/>
+              </w:rPr>
+              <w:t>Con 1.000 cotizaciones almacenadas, la búsqueda y los filtros responden en menos de 2 segundos.</w:t>
+            </w:r>
+          </w:p>
+        </w:tc>
+        <w:tc>
+          <w:tcPr>
+            <w:tcW w:type="dxa" w:w="2835"/>
+          </w:tcPr>
+          <w:p>
+            <w:r>
+              <w:rPr>
+                <w:rFonts w:asciiTheme="minorHAnsi" w:hAnsiTheme="minorHAnsi" w:cstheme="minorHAnsi"/>
+                <w:b w:val="0"/>
+                <w:color w:val="000000"/>
+                <w:sz w:val="18"/>
+              </w:rPr>
+              <w:t>Prueba de rendimiento con una base de 1.000 cotizaciones ficticias, midiendo el tiempo de respuesta del endpoint de listado.</w:t>
+            </w:r>
+          </w:p>
+        </w:tc>
+        <w:tc>
+          <w:tcPr>
+            <w:tcW w:type="dxa" w:w="907"/>
+          </w:tcPr>
+          <w:p>
+            <w:r>
+              <w:rPr>
+                <w:rFonts w:asciiTheme="minorHAnsi" w:hAnsiTheme="minorHAnsi" w:cstheme="minorHAnsi"/>
+                <w:b w:val="0"/>
+                <w:color w:val="000000"/>
+                <w:sz w:val="18"/>
+              </w:rPr>
+              <w:t>HU-07, HU-08</w:t>
+            </w:r>
+          </w:p>
+        </w:tc>
+      </w:tr>
+      <w:tr>
+        <w:tc>
+          <w:tcPr>
+            <w:tcW w:type="dxa" w:w="907"/>
+          </w:tcPr>
+          <w:p>
+            <w:r>
+              <w:rPr>
+                <w:rFonts w:asciiTheme="minorHAnsi" w:hAnsiTheme="minorHAnsi" w:cstheme="minorHAnsi"/>
+                <w:b w:val="0"/>
+                <w:color w:val="000000"/>
+                <w:sz w:val="18"/>
+              </w:rPr>
+              <w:t>RNF-06</w:t>
+            </w:r>
+          </w:p>
+        </w:tc>
+        <w:tc>
+          <w:tcPr>
+            <w:tcW w:type="dxa" w:w="1361"/>
+          </w:tcPr>
+          <w:p>
+            <w:r>
+              <w:rPr>
+                <w:rFonts w:asciiTheme="minorHAnsi" w:hAnsiTheme="minorHAnsi" w:cstheme="minorHAnsi"/>
+                <w:b w:val="0"/>
+                <w:color w:val="000000"/>
+                <w:sz w:val="18"/>
+              </w:rPr>
+              <w:t>Eficiencia de desempeño</w:t>
+            </w:r>
+          </w:p>
+        </w:tc>
+        <w:tc>
+          <w:tcPr>
+            <w:tcW w:type="dxa" w:w="2778"/>
+          </w:tcPr>
+          <w:p>
+            <w:r>
+              <w:rPr>
+                <w:rFonts w:asciiTheme="minorHAnsi" w:hAnsiTheme="minorHAnsi" w:cstheme="minorHAnsi"/>
+                <w:b w:val="0"/>
+                <w:color w:val="000000"/>
+                <w:sz w:val="18"/>
+              </w:rPr>
+              <w:t>Un PDF nuevo en Drive se detecta en un máximo de 15 minutos.</w:t>
+            </w:r>
+          </w:p>
+        </w:tc>
+        <w:tc>
+          <w:tcPr>
+            <w:tcW w:type="dxa" w:w="2835"/>
+          </w:tcPr>
+          <w:p>
+            <w:r>
+              <w:rPr>
+                <w:rFonts w:asciiTheme="minorHAnsi" w:hAnsiTheme="minorHAnsi" w:cstheme="minorHAnsi"/>
+                <w:b w:val="0"/>
+                <w:color w:val="000000"/>
+                <w:sz w:val="18"/>
+              </w:rPr>
+              <w:t>Prueba de integración: se sube un PDF de prueba y se registra el tiempo hasta que aparece en la base de datos.</w:t>
+            </w:r>
+          </w:p>
+        </w:tc>
+        <w:tc>
+          <w:tcPr>
+            <w:tcW w:type="dxa" w:w="907"/>
+          </w:tcPr>
+          <w:p>
+            <w:r>
+              <w:rPr>
+                <w:rFonts w:asciiTheme="minorHAnsi" w:hAnsiTheme="minorHAnsi" w:cstheme="minorHAnsi"/>
+                <w:b w:val="0"/>
+                <w:color w:val="000000"/>
+                <w:sz w:val="18"/>
+              </w:rPr>
+              <w:t>HU-01</w:t>
+            </w:r>
+          </w:p>
+        </w:tc>
+      </w:tr>
+      <w:tr>
+        <w:tc>
+          <w:tcPr>
+            <w:tcW w:type="dxa" w:w="907"/>
+          </w:tcPr>
+          <w:p>
+            <w:r>
+              <w:rPr>
+                <w:rFonts w:asciiTheme="minorHAnsi" w:hAnsiTheme="minorHAnsi" w:cstheme="minorHAnsi"/>
+                <w:b w:val="0"/>
+                <w:color w:val="000000"/>
+                <w:sz w:val="18"/>
+              </w:rPr>
+              <w:t>RNF-07</w:t>
+            </w:r>
+          </w:p>
+        </w:tc>
+        <w:tc>
+          <w:tcPr>
+            <w:tcW w:type="dxa" w:w="1361"/>
+          </w:tcPr>
+          <w:p>
+            <w:r>
+              <w:rPr>
+                <w:rFonts w:asciiTheme="minorHAnsi" w:hAnsiTheme="minorHAnsi" w:cstheme="minorHAnsi"/>
+                <w:b w:val="0"/>
+                <w:color w:val="000000"/>
+                <w:sz w:val="18"/>
+              </w:rPr>
+              <w:t>Adecuación funcional</w:t>
+            </w:r>
+          </w:p>
+        </w:tc>
+        <w:tc>
+          <w:tcPr>
+            <w:tcW w:type="dxa" w:w="2778"/>
+          </w:tcPr>
+          <w:p>
+            <w:r>
+              <w:rPr>
+                <w:rFonts w:asciiTheme="minorHAnsi" w:hAnsiTheme="minorHAnsi" w:cstheme="minorHAnsi"/>
+                <w:b w:val="0"/>
+                <w:color w:val="000000"/>
+                <w:sz w:val="18"/>
+              </w:rPr>
+              <w:t>Al menos el 95 % de las cotizaciones de formato estándar queda con todos sus campos correctos, y las métricas coinciden exactamente con la base de datos.</w:t>
+            </w:r>
+          </w:p>
+        </w:tc>
+        <w:tc>
+          <w:tcPr>
+            <w:tcW w:type="dxa" w:w="2835"/>
+          </w:tcPr>
+          <w:p>
+            <w:r>
+              <w:rPr>
+                <w:rFonts w:asciiTheme="minorHAnsi" w:hAnsiTheme="minorHAnsi" w:cstheme="minorHAnsi"/>
+                <w:b w:val="0"/>
+                <w:color w:val="000000"/>
+                <w:sz w:val="18"/>
+              </w:rPr>
+              <w:t>Medición de precisión por campo sobre el set de PDF de prueba; comparación de cada métrica con una consulta SQL directa.</w:t>
+            </w:r>
+          </w:p>
+        </w:tc>
+        <w:tc>
+          <w:tcPr>
+            <w:tcW w:type="dxa" w:w="907"/>
+          </w:tcPr>
+          <w:p>
+            <w:r>
+              <w:rPr>
+                <w:rFonts w:asciiTheme="minorHAnsi" w:hAnsiTheme="minorHAnsi" w:cstheme="minorHAnsi"/>
+                <w:b w:val="0"/>
+                <w:color w:val="000000"/>
+                <w:sz w:val="18"/>
+              </w:rPr>
+              <w:t>HU-02, HU-10, HU-11</w:t>
+            </w:r>
+          </w:p>
+        </w:tc>
+      </w:tr>
+      <w:tr>
+        <w:tc>
+          <w:tcPr>
+            <w:tcW w:type="dxa" w:w="907"/>
+          </w:tcPr>
+          <w:p>
+            <w:r>
+              <w:rPr>
+                <w:rFonts w:asciiTheme="minorHAnsi" w:hAnsiTheme="minorHAnsi" w:cstheme="minorHAnsi"/>
+                <w:b w:val="0"/>
+                <w:color w:val="000000"/>
+                <w:sz w:val="18"/>
+              </w:rPr>
+              <w:t>RNF-08</w:t>
+            </w:r>
+          </w:p>
+        </w:tc>
+        <w:tc>
+          <w:tcPr>
+            <w:tcW w:type="dxa" w:w="1361"/>
+          </w:tcPr>
+          <w:p>
+            <w:r>
+              <w:rPr>
+                <w:rFonts w:asciiTheme="minorHAnsi" w:hAnsiTheme="minorHAnsi" w:cstheme="minorHAnsi"/>
+                <w:b w:val="0"/>
+                <w:color w:val="000000"/>
+                <w:sz w:val="18"/>
+              </w:rPr>
+              <w:t>Fiabilidad</w:t>
+            </w:r>
+          </w:p>
+        </w:tc>
+        <w:tc>
+          <w:tcPr>
+            <w:tcW w:type="dxa" w:w="2778"/>
+          </w:tcPr>
+          <w:p>
+            <w:r>
+              <w:rPr>
+                <w:rFonts w:asciiTheme="minorHAnsi" w:hAnsiTheme="minorHAnsi" w:cstheme="minorHAnsi"/>
+                <w:b w:val="0"/>
+                <w:color w:val="000000"/>
+                <w:sz w:val="18"/>
+              </w:rPr>
+              <w:t>Los datos quedan íntegros: sin cotizaciones duplicadas, sin datos parciales si la extracción falla y con advertencia si el total no es igual a neto + IVA.</w:t>
+            </w:r>
+          </w:p>
+        </w:tc>
+        <w:tc>
+          <w:tcPr>
+            <w:tcW w:type="dxa" w:w="2835"/>
+          </w:tcPr>
+          <w:p>
+            <w:r>
+              <w:rPr>
+                <w:rFonts w:asciiTheme="minorHAnsi" w:hAnsiTheme="minorHAnsi" w:cstheme="minorHAnsi"/>
+                <w:b w:val="0"/>
+                <w:color w:val="000000"/>
+                <w:sz w:val="18"/>
+              </w:rPr>
+              <w:t>Prueba de integración: el mismo PDF subido dos veces genera un solo registro; un fallo simulado de la IA no deja datos guardados.</w:t>
+            </w:r>
+          </w:p>
+        </w:tc>
+        <w:tc>
+          <w:tcPr>
+            <w:tcW w:type="dxa" w:w="907"/>
+          </w:tcPr>
+          <w:p>
+            <w:r>
+              <w:rPr>
+                <w:rFonts w:asciiTheme="minorHAnsi" w:hAnsiTheme="minorHAnsi" w:cstheme="minorHAnsi"/>
+                <w:b w:val="0"/>
+                <w:color w:val="000000"/>
+                <w:sz w:val="18"/>
+              </w:rPr>
+              <w:t>HU-03, HU-04</w:t>
+            </w:r>
+          </w:p>
+        </w:tc>
+      </w:tr>
+      <w:tr>
+        <w:tc>
+          <w:tcPr>
+            <w:tcW w:type="dxa" w:w="907"/>
+          </w:tcPr>
+          <w:p>
+            <w:r>
+              <w:rPr>
+                <w:rFonts w:asciiTheme="minorHAnsi" w:hAnsiTheme="minorHAnsi" w:cstheme="minorHAnsi"/>
+                <w:b w:val="0"/>
+                <w:color w:val="000000"/>
+                <w:sz w:val="18"/>
+              </w:rPr>
+              <w:t>RNF-09</w:t>
+            </w:r>
+          </w:p>
+        </w:tc>
+        <w:tc>
+          <w:tcPr>
+            <w:tcW w:type="dxa" w:w="1361"/>
+          </w:tcPr>
+          <w:p>
+            <w:r>
+              <w:rPr>
+                <w:rFonts w:asciiTheme="minorHAnsi" w:hAnsiTheme="minorHAnsi" w:cstheme="minorHAnsi"/>
+                <w:b w:val="0"/>
+                <w:color w:val="000000"/>
+                <w:sz w:val="18"/>
+              </w:rPr>
+              <w:t>Usabilidad</w:t>
+            </w:r>
+          </w:p>
+        </w:tc>
+        <w:tc>
+          <w:tcPr>
+            <w:tcW w:type="dxa" w:w="2778"/>
+          </w:tcPr>
+          <w:p>
+            <w:r>
+              <w:rPr>
+                <w:rFonts w:asciiTheme="minorHAnsi" w:hAnsiTheme="minorHAnsi" w:cstheme="minorHAnsi"/>
+                <w:b w:val="0"/>
+                <w:color w:val="000000"/>
+                <w:sz w:val="18"/>
+              </w:rPr>
+              <w:t>La interfaz cumple el nivel AA de las WCAG 2.1 y se puede usar en escritorio y en el celular.</w:t>
+            </w:r>
+          </w:p>
+        </w:tc>
+        <w:tc>
+          <w:tcPr>
+            <w:tcW w:type="dxa" w:w="2835"/>
+          </w:tcPr>
+          <w:p>
+            <w:r>
+              <w:rPr>
+                <w:rFonts w:asciiTheme="minorHAnsi" w:hAnsiTheme="minorHAnsi" w:cstheme="minorHAnsi"/>
+                <w:b w:val="0"/>
+                <w:color w:val="000000"/>
+                <w:sz w:val="18"/>
+              </w:rPr>
+              <w:t>Auditoría automática con axe-core en cada pantalla, en modo claro y oscuro y en tamaño móvil: cero problemas.</w:t>
+            </w:r>
+          </w:p>
+        </w:tc>
+        <w:tc>
+          <w:tcPr>
+            <w:tcW w:type="dxa" w:w="907"/>
+          </w:tcPr>
+          <w:p>
+            <w:r>
+              <w:rPr>
+                <w:rFonts w:asciiTheme="minorHAnsi" w:hAnsiTheme="minorHAnsi" w:cstheme="minorHAnsi"/>
+                <w:b w:val="0"/>
+                <w:color w:val="000000"/>
+                <w:sz w:val="18"/>
+              </w:rPr>
+              <w:t>HU-05, HU-07 a HU-11</w:t>
+            </w:r>
+          </w:p>
+        </w:tc>
+      </w:tr>
+      <w:tr>
+        <w:tc>
+          <w:tcPr>
+            <w:tcW w:type="dxa" w:w="907"/>
+          </w:tcPr>
+          <w:p>
+            <w:r>
+              <w:rPr>
+                <w:rFonts w:asciiTheme="minorHAnsi" w:hAnsiTheme="minorHAnsi" w:cstheme="minorHAnsi"/>
+                <w:b w:val="0"/>
+                <w:color w:val="000000"/>
+                <w:sz w:val="18"/>
+              </w:rPr>
+              <w:t>RNF-10</w:t>
+            </w:r>
+          </w:p>
+        </w:tc>
+        <w:tc>
+          <w:tcPr>
+            <w:tcW w:type="dxa" w:w="1361"/>
+          </w:tcPr>
+          <w:p>
+            <w:r>
+              <w:rPr>
+                <w:rFonts w:asciiTheme="minorHAnsi" w:hAnsiTheme="minorHAnsi" w:cstheme="minorHAnsi"/>
+                <w:b w:val="0"/>
+                <w:color w:val="000000"/>
+                <w:sz w:val="18"/>
+              </w:rPr>
+              <w:t>Usabilidad</w:t>
+            </w:r>
+          </w:p>
+        </w:tc>
+        <w:tc>
+          <w:tcPr>
+            <w:tcW w:type="dxa" w:w="2778"/>
+          </w:tcPr>
+          <w:p>
+            <w:r>
+              <w:rPr>
+                <w:rFonts w:asciiTheme="minorHAnsi" w:hAnsiTheme="minorHAnsi" w:cstheme="minorHAnsi"/>
+                <w:b w:val="0"/>
+                <w:color w:val="000000"/>
+                <w:sz w:val="18"/>
+              </w:rPr>
+              <w:t>La interfaz está en español de Chile: montos en pesos con separador de miles, fechas en formato local e IVA indicado.</w:t>
+            </w:r>
+          </w:p>
+        </w:tc>
+        <w:tc>
+          <w:tcPr>
+            <w:tcW w:type="dxa" w:w="2835"/>
+          </w:tcPr>
+          <w:p>
+            <w:r>
+              <w:rPr>
+                <w:rFonts w:asciiTheme="minorHAnsi" w:hAnsiTheme="minorHAnsi" w:cstheme="minorHAnsi"/>
+                <w:b w:val="0"/>
+                <w:color w:val="000000"/>
+                <w:sz w:val="18"/>
+              </w:rPr>
+              <w:t>Revisión de cada pantalla contra el plan de pruebas del frontend.</w:t>
+            </w:r>
+          </w:p>
+        </w:tc>
+        <w:tc>
+          <w:tcPr>
+            <w:tcW w:type="dxa" w:w="907"/>
+          </w:tcPr>
+          <w:p>
+            <w:r>
+              <w:rPr>
+                <w:rFonts w:asciiTheme="minorHAnsi" w:hAnsiTheme="minorHAnsi" w:cstheme="minorHAnsi"/>
+                <w:b w:val="0"/>
+                <w:color w:val="000000"/>
+                <w:sz w:val="18"/>
+              </w:rPr>
+              <w:t>HU-09 a HU-11</w:t>
+            </w:r>
+          </w:p>
+        </w:tc>
+      </w:tr>
+      <w:tr>
+        <w:tc>
+          <w:tcPr>
+            <w:tcW w:type="dxa" w:w="907"/>
+          </w:tcPr>
+          <w:p>
+            <w:r>
+              <w:rPr>
+                <w:rFonts w:asciiTheme="minorHAnsi" w:hAnsiTheme="minorHAnsi" w:cstheme="minorHAnsi"/>
+                <w:b w:val="0"/>
+                <w:color w:val="000000"/>
+                <w:sz w:val="18"/>
+              </w:rPr>
+              <w:t>RNF-11</w:t>
+            </w:r>
+          </w:p>
+        </w:tc>
+        <w:tc>
+          <w:tcPr>
+            <w:tcW w:type="dxa" w:w="1361"/>
+          </w:tcPr>
+          <w:p>
+            <w:r>
+              <w:rPr>
+                <w:rFonts w:asciiTheme="minorHAnsi" w:hAnsiTheme="minorHAnsi" w:cstheme="minorHAnsi"/>
+                <w:b w:val="0"/>
+                <w:color w:val="000000"/>
+                <w:sz w:val="18"/>
+              </w:rPr>
+              <w:t>Mantenibilidad</w:t>
+            </w:r>
+          </w:p>
+        </w:tc>
+        <w:tc>
+          <w:tcPr>
+            <w:tcW w:type="dxa" w:w="2778"/>
+          </w:tcPr>
+          <w:p>
+            <w:r>
+              <w:rPr>
+                <w:rFonts w:asciiTheme="minorHAnsi" w:hAnsiTheme="minorHAnsi" w:cstheme="minorHAnsi"/>
+                <w:b w:val="0"/>
+                <w:color w:val="000000"/>
+                <w:sz w:val="18"/>
+              </w:rPr>
+              <w:t>El código tiene pruebas automatizadas que se ejecutan en cada cambio a la rama main, y el contrato de la API se verifica automáticamente.</w:t>
+            </w:r>
+          </w:p>
+        </w:tc>
+        <w:tc>
+          <w:tcPr>
+            <w:tcW w:type="dxa" w:w="2835"/>
+          </w:tcPr>
+          <w:p>
+            <w:r>
+              <w:rPr>
+                <w:rFonts w:asciiTheme="minorHAnsi" w:hAnsiTheme="minorHAnsi" w:cstheme="minorHAnsi"/>
+                <w:b w:val="0"/>
+                <w:color w:val="000000"/>
+                <w:sz w:val="18"/>
+              </w:rPr>
+              <w:t>Integración continua en GitHub Actions en verde; verificación del contrato aprobada contra la API.</w:t>
+            </w:r>
+          </w:p>
+        </w:tc>
+        <w:tc>
+          <w:tcPr>
+            <w:tcW w:type="dxa" w:w="907"/>
+          </w:tcPr>
+          <w:p>
+            <w:r>
+              <w:rPr>
+                <w:rFonts w:asciiTheme="minorHAnsi" w:hAnsiTheme="minorHAnsi" w:cstheme="minorHAnsi"/>
+                <w:b w:val="0"/>
+                <w:color w:val="000000"/>
+                <w:sz w:val="18"/>
+              </w:rPr>
+              <w:t>Todas</w:t>
+            </w:r>
+          </w:p>
+        </w:tc>
+      </w:tr>
+      <w:tr>
+        <w:tc>
+          <w:tcPr>
+            <w:tcW w:type="dxa" w:w="907"/>
+          </w:tcPr>
+          <w:p>
+            <w:r>
+              <w:rPr>
+                <w:rFonts w:asciiTheme="minorHAnsi" w:hAnsiTheme="minorHAnsi" w:cstheme="minorHAnsi"/>
+                <w:b w:val="0"/>
+                <w:color w:val="000000"/>
+                <w:sz w:val="18"/>
+              </w:rPr>
+              <w:t>RNF-12</w:t>
+            </w:r>
+          </w:p>
+        </w:tc>
+        <w:tc>
+          <w:tcPr>
+            <w:tcW w:type="dxa" w:w="1361"/>
+          </w:tcPr>
+          <w:p>
+            <w:r>
+              <w:rPr>
+                <w:rFonts w:asciiTheme="minorHAnsi" w:hAnsiTheme="minorHAnsi" w:cstheme="minorHAnsi"/>
+                <w:b w:val="0"/>
+                <w:color w:val="000000"/>
+                <w:sz w:val="18"/>
+              </w:rPr>
+              <w:t>Portabilidad</w:t>
+            </w:r>
+          </w:p>
+        </w:tc>
+        <w:tc>
+          <w:tcPr>
+            <w:tcW w:type="dxa" w:w="2778"/>
+          </w:tcPr>
+          <w:p>
+            <w:r>
+              <w:rPr>
+                <w:rFonts w:asciiTheme="minorHAnsi" w:hAnsiTheme="minorHAnsi" w:cstheme="minorHAnsi"/>
+                <w:b w:val="0"/>
+                <w:color w:val="000000"/>
+                <w:sz w:val="18"/>
+              </w:rPr>
+              <w:t>El sistema se levanta con Docker Compose y variables de entorno documentadas en el README.</w:t>
+            </w:r>
+          </w:p>
+        </w:tc>
+        <w:tc>
+          <w:tcPr>
+            <w:tcW w:type="dxa" w:w="2835"/>
+          </w:tcPr>
+          <w:p>
+            <w:r>
+              <w:rPr>
+                <w:rFonts w:asciiTheme="minorHAnsi" w:hAnsiTheme="minorHAnsi" w:cstheme="minorHAnsi"/>
+                <w:b w:val="0"/>
+                <w:color w:val="000000"/>
+                <w:sz w:val="18"/>
+              </w:rPr>
+              <w:t>Instalación desde cero en un equipo limpio siguiendo solo el README.</w:t>
+            </w:r>
+          </w:p>
+        </w:tc>
+        <w:tc>
+          <w:tcPr>
+            <w:tcW w:type="dxa" w:w="907"/>
+          </w:tcPr>
+          <w:p>
+            <w:r>
+              <w:rPr>
+                <w:rFonts w:asciiTheme="minorHAnsi" w:hAnsiTheme="minorHAnsi" w:cstheme="minorHAnsi"/>
+                <w:b w:val="0"/>
+                <w:color w:val="000000"/>
+                <w:sz w:val="18"/>
+              </w:rPr>
+              <w:t>HU-12</w:t>
+            </w:r>
+          </w:p>
+        </w:tc>
+      </w:tr>
+      <w:tr>
+        <w:tc>
+          <w:tcPr>
+            <w:tcW w:type="dxa" w:w="907"/>
+          </w:tcPr>
+          <w:p>
+            <w:r>
+              <w:rPr>
+                <w:rFonts w:asciiTheme="minorHAnsi" w:hAnsiTheme="minorHAnsi" w:cstheme="minorHAnsi"/>
+                <w:b w:val="0"/>
+                <w:color w:val="000000"/>
+                <w:sz w:val="18"/>
+              </w:rPr>
+              <w:t>RNF-13</w:t>
+            </w:r>
+          </w:p>
+        </w:tc>
+        <w:tc>
+          <w:tcPr>
+            <w:tcW w:type="dxa" w:w="1361"/>
+          </w:tcPr>
+          <w:p>
+            <w:r>
+              <w:rPr>
+                <w:rFonts w:asciiTheme="minorHAnsi" w:hAnsiTheme="minorHAnsi" w:cstheme="minorHAnsi"/>
+                <w:b w:val="0"/>
+                <w:color w:val="000000"/>
+                <w:sz w:val="18"/>
+              </w:rPr>
+              <w:t>Compatibilidad</w:t>
+            </w:r>
+          </w:p>
+        </w:tc>
+        <w:tc>
+          <w:tcPr>
+            <w:tcW w:type="dxa" w:w="2778"/>
+          </w:tcPr>
+          <w:p>
+            <w:r>
+              <w:rPr>
+                <w:rFonts w:asciiTheme="minorHAnsi" w:hAnsiTheme="minorHAnsi" w:cstheme="minorHAnsi"/>
+                <w:b w:val="0"/>
+                <w:color w:val="000000"/>
+                <w:sz w:val="18"/>
+              </w:rPr>
+              <w:t>La aplicación funciona en las versiones vigentes de Chrome, Edge y Firefox.</w:t>
+            </w:r>
+          </w:p>
+        </w:tc>
+        <w:tc>
+          <w:tcPr>
+            <w:tcW w:type="dxa" w:w="2835"/>
+          </w:tcPr>
+          <w:p>
+            <w:r>
+              <w:rPr>
+                <w:rFonts w:asciiTheme="minorHAnsi" w:hAnsiTheme="minorHAnsi" w:cstheme="minorHAnsi"/>
+                <w:b w:val="0"/>
+                <w:color w:val="000000"/>
+                <w:sz w:val="18"/>
+              </w:rPr>
+              <w:t>Ejecución de los casos de prueba manuales en los tres navegadores.</w:t>
+            </w:r>
+          </w:p>
+        </w:tc>
+        <w:tc>
+          <w:tcPr>
+            <w:tcW w:type="dxa" w:w="907"/>
+          </w:tcPr>
+          <w:p>
+            <w:r>
+              <w:rPr>
+                <w:rFonts w:asciiTheme="minorHAnsi" w:hAnsiTheme="minorHAnsi" w:cstheme="minorHAnsi"/>
+                <w:b w:val="0"/>
+                <w:color w:val="000000"/>
+                <w:sz w:val="18"/>
+              </w:rPr>
+              <w:t>HU-05, HU-07 a HU-11</w:t>
+            </w:r>
+          </w:p>
+        </w:tc>
+      </w:tr>
+      <w:tr>
+        <w:tc>
+          <w:tcPr>
+            <w:tcW w:type="dxa" w:w="907"/>
+          </w:tcPr>
+          <w:p>
+            <w:r>
+              <w:rPr>
+                <w:rFonts w:asciiTheme="minorHAnsi" w:hAnsiTheme="minorHAnsi" w:cstheme="minorHAnsi"/>
+                <w:b w:val="0"/>
+                <w:color w:val="000000"/>
+                <w:sz w:val="18"/>
+              </w:rPr>
+              <w:t>RNF-14</w:t>
+            </w:r>
+          </w:p>
+        </w:tc>
+        <w:tc>
+          <w:tcPr>
+            <w:tcW w:type="dxa" w:w="1361"/>
+          </w:tcPr>
+          <w:p>
+            <w:r>
+              <w:rPr>
+                <w:rFonts w:asciiTheme="minorHAnsi" w:hAnsiTheme="minorHAnsi" w:cstheme="minorHAnsi"/>
+                <w:b w:val="0"/>
+                <w:color w:val="000000"/>
+                <w:sz w:val="18"/>
+              </w:rPr>
+              <w:t>Seguridad (privacidad)</w:t>
+            </w:r>
+          </w:p>
+        </w:tc>
+        <w:tc>
+          <w:tcPr>
+            <w:tcW w:type="dxa" w:w="2778"/>
+          </w:tcPr>
+          <w:p>
+            <w:r>
+              <w:rPr>
+                <w:rFonts w:asciiTheme="minorHAnsi" w:hAnsiTheme="minorHAnsi" w:cstheme="minorHAnsi"/>
+                <w:b w:val="0"/>
+                <w:color w:val="000000"/>
+                <w:sz w:val="18"/>
+              </w:rPr>
+              <w:t>Las cotizaciones reales de la empresa no se suben al repositorio; las pruebas usan documentos ficticios, en línea con la Ley 19.628.</w:t>
+            </w:r>
+          </w:p>
+        </w:tc>
+        <w:tc>
+          <w:tcPr>
+            <w:tcW w:type="dxa" w:w="2835"/>
+          </w:tcPr>
+          <w:p>
+            <w:r>
+              <w:rPr>
+                <w:rFonts w:asciiTheme="minorHAnsi" w:hAnsiTheme="minorHAnsi" w:cstheme="minorHAnsi"/>
+                <w:b w:val="0"/>
+                <w:color w:val="000000"/>
+                <w:sz w:val="18"/>
+              </w:rPr>
+              <w:t>Revisión del repositorio antes de cada entrega: solo documentos ficticios.</w:t>
+            </w:r>
+          </w:p>
+        </w:tc>
+        <w:tc>
+          <w:tcPr>
+            <w:tcW w:type="dxa" w:w="907"/>
+          </w:tcPr>
+          <w:p>
+            <w:r>
+              <w:rPr>
+                <w:rFonts w:asciiTheme="minorHAnsi" w:hAnsiTheme="minorHAnsi" w:cstheme="minorHAnsi"/>
+                <w:b w:val="0"/>
+                <w:color w:val="000000"/>
+                <w:sz w:val="18"/>
+              </w:rPr>
+              <w:t>HU-02, HU-04</w:t>
+            </w:r>
+          </w:p>
+        </w:tc>
+      </w:tr>
+    </w:tbl>
+    <w:p>
+      <w:pPr/>
+    </w:p>
+    <w:p>
+      <w:pPr/>
+      <w:r>
+        <w:t>A la semana 9 se verifican sobre el frontend, con datos simulados, RNF-09, RNF-10 y la integración continua de RNF-11. Los demás dependen de la API, la ingesta y la base de datos, que aún no tienen código en el repositorio, y se verifican a medida que esas historias se integran.</w:t>
+      </w:r>
+    </w:p>
+    <w:p>
+      <w:pPr>
+        <w:pStyle w:val="Ttulo2"/>
+      </w:pPr>
+      <w:r>
+        <w:t>Referencias</w:t>
+      </w:r>
+    </w:p>
+    <w:p>
+      <w:pPr>
+        <w:pStyle w:val="Prrafodelista"/>
+        <w:numPr>
+          <w:ilvl w:val="0"/>
+          <w:numId w:val="15"/>
+        </w:numPr>
+        <w:spacing w:after="40"/>
+      </w:pPr>
+      <w:r>
+        <w:t xml:space="preserve">International Organization for Standardization. (2011). </w:t>
+      </w:r>
+      <w:r>
         <w:rPr>
-          <w:b w:val="0"/>
+          <w:i/>
         </w:rPr>
-        <w:t xml:space="preserve"> la IA solo actúa sobre los documentos que las reglas no resuelven, y el despliegue necesita el sistema completo.</w:t>
-      </w:r>
-    </w:p>
-    <w:p>
-      <w:pPr/>
+        <w:t>ISO/IEC 25010:2011. Systems and software engineering — Systems and software Quality Requirements and Evaluation (SQuaRE) — System and software quality models</w:t>
+      </w:r>
+      <w:r>
+        <w:t>. ISO.</w:t>
+      </w:r>
+    </w:p>
+    <w:p>
+      <w:pPr>
+        <w:pStyle w:val="Prrafodelista"/>
+        <w:numPr>
+          <w:ilvl w:val="0"/>
+          <w:numId w:val="15"/>
+        </w:numPr>
+        <w:spacing w:after="40"/>
+      </w:pPr>
+      <w:r>
+        <w:t xml:space="preserve">World Wide Web Consortium. (2018). </w:t>
+      </w:r>
       <w:r>
         <w:rPr>
-          <w:b w:val="0"/>
+          <w:i/>
         </w:rPr>
-        <w:t>El backlog se revisa al cierre de cada sprint. Si un sprint no alcanza su meta, se repriorizan las historias pendientes antes de mover la fecha de integración.</w:t>
+        <w:t>Web Content Accessibility Guidelines (WCAG) 2.1</w:t>
+      </w:r>
+      <w:r>
+        <w:t>. W3C Recommendation. https://www.w3.org/TR/WCAG21/</w:t>
+      </w:r>
+    </w:p>
+    <w:p>
+      <w:pPr>
+        <w:pStyle w:val="Prrafodelista"/>
+        <w:numPr>
+          <w:ilvl w:val="0"/>
+          <w:numId w:val="15"/>
+        </w:numPr>
+        <w:spacing w:after="40"/>
+      </w:pPr>
+      <w:r>
+        <w:t>Ley N.º 19.628. Sobre protección de la vida privada. (1999). Diario Oficial de la República de Chile. https://www.bcn.cl/leychile/navegar?idNorma=141599</w:t>
       </w:r>
     </w:p>
     <w:sectPr>

</xml_diff>